<commit_message>
Add BST level order traversal implementation
Adds BST level order traversal implementation

Introduces a method for level order traversal of a binary search tree to demonstrate breadth-first traversal. Expands documentation with additional algorithm questions and explanations to aid understanding of data structure concepts.
</commit_message>
<xml_diff>
--- a/Day-Wise Docs/DAY18_109940600_VIKASKUMAR.docx
+++ b/Day-Wise Docs/DAY18_109940600_VIKASKUMAR.docx
@@ -3,6 +3,9 @@
 <w:document xmlns:wpc="http://schemas.microsoft.com/office/word/2010/wordprocessingCanvas" xmlns:cx="http://schemas.microsoft.com/office/drawing/2014/chartex" xmlns:cx1="http://schemas.microsoft.com/office/drawing/2015/9/8/chartex" xmlns:cx2="http://schemas.microsoft.com/office/drawing/2015/10/21/chartex" xmlns:cx3="http://schemas.microsoft.com/office/drawing/2016/5/9/chartex" xmlns:cx4="http://schemas.microsoft.com/office/drawing/2016/5/10/chartex" xmlns:cx5="http://schemas.microsoft.com/office/drawing/2016/5/11/chartex" xmlns:cx6="http://schemas.microsoft.com/office/drawing/2016/5/12/chartex" xmlns:cx7="http://schemas.microsoft.com/office/drawing/2016/5/13/chartex" xmlns:cx8="http://schemas.microsoft.com/office/drawing/2016/5/14/chartex" xmlns:mc="http://schemas.openxmlformats.org/markup-compatibility/2006" xmlns:aink="http://schemas.microsoft.com/office/drawing/2016/ink" xmlns:am3d="http://schemas.microsoft.com/office/drawing/2017/model3d" xmlns:o="urn:schemas-microsoft-com:office:office" xmlns:r="http://schemas.openxmlformats.org/officeDocument/2006/relationships" xmlns:m="http://schemas.openxmlformats.org/officeDocument/2006/math" xmlns:v="urn:schemas-microsoft-com:vml" xmlns:wp14="http://schemas.microsoft.com/office/word/2010/wordprocessingDrawing" xmlns:wp="http://schemas.openxmlformats.org/drawingml/2006/wordprocessingDrawing" xmlns:w10="urn:schemas-microsoft-com:office:word" xmlns:w="http://schemas.openxmlformats.org/wordprocessingml/2006/main" xmlns:w14="http://schemas.microsoft.com/office/word/2010/wordml" xmlns:w15="http://schemas.microsoft.com/office/word/2012/wordml" xmlns:w16cex="http://schemas.microsoft.com/office/word/2018/wordml/cex" xmlns:w16cid="http://schemas.microsoft.com/office/word/2016/wordml/cid" xmlns:w16="http://schemas.microsoft.com/office/word/2018/wordml" xmlns:w16sdtdh="http://schemas.microsoft.com/office/word/2020/wordml/sdtdatahash" xmlns:w16se="http://schemas.microsoft.com/office/word/2015/wordml/symex" xmlns:wpg="http://schemas.microsoft.com/office/word/2010/wordprocessingGroup" xmlns:wpi="http://schemas.microsoft.com/office/word/2010/wordprocessingInk" xmlns:wne="http://schemas.microsoft.com/office/word/2006/wordml" xmlns:wps="http://schemas.microsoft.com/office/word/2010/wordprocessingShape" mc:Ignorable="w14 w15 w16se w16cid w16 w16cex w16sdtdh wp14">
   <w:body>
     <w:p>
+      <w:pPr>
+        <w:ind w:firstLine="720"/>
+      </w:pPr>
       <w:bookmarkStart w:id="0" w:name="_Hlk203561219"/>
       <w:bookmarkEnd w:id="0"/>
       <w:r>
@@ -23,15 +26,7 @@
     </w:p>
     <w:p>
       <w:r>
-        <w:t xml:space="preserve">import </w:t>
-      </w:r>
-      <w:proofErr w:type="spellStart"/>
-      <w:r>
-        <w:t>java.util</w:t>
-      </w:r>
-      <w:proofErr w:type="spellEnd"/>
-      <w:r>
-        <w:t>.*;</w:t>
+        <w:t>import java.util.*;</w:t>
       </w:r>
     </w:p>
     <w:p/>
@@ -49,44 +44,12 @@
     <w:p/>
     <w:p>
       <w:r>
-        <w:t xml:space="preserve">    public void put(String </w:t>
-      </w:r>
-      <w:proofErr w:type="spellStart"/>
-      <w:r>
-        <w:t>keyval</w:t>
-      </w:r>
-      <w:proofErr w:type="spellEnd"/>
-      <w:r>
-        <w:t>, int value) {</w:t>
-      </w:r>
-    </w:p>
-    <w:p>
-      <w:r>
-        <w:t xml:space="preserve">        int index = </w:t>
-      </w:r>
-      <w:proofErr w:type="spellStart"/>
-      <w:r>
-        <w:t>Math.abs</w:t>
-      </w:r>
-      <w:proofErr w:type="spellEnd"/>
-      <w:r>
-        <w:t>(</w:t>
-      </w:r>
-      <w:proofErr w:type="spellStart"/>
-      <w:r>
-        <w:t>keyval.hashCode</w:t>
-      </w:r>
-      <w:proofErr w:type="spellEnd"/>
-      <w:r>
-        <w:t xml:space="preserve">() % </w:t>
-      </w:r>
-      <w:proofErr w:type="spellStart"/>
-      <w:r>
-        <w:t>data.length</w:t>
-      </w:r>
-      <w:proofErr w:type="spellEnd"/>
-      <w:r>
-        <w:t>);</w:t>
+        <w:t xml:space="preserve">    public void put(String keyval, int value) {</w:t>
+      </w:r>
+    </w:p>
+    <w:p>
+      <w:r>
+        <w:t xml:space="preserve">        int index = Math.abs(keyval.hashCode() % data.length);</w:t>
       </w:r>
     </w:p>
     <w:p/>
@@ -112,36 +75,12 @@
     </w:p>
     <w:p>
       <w:r>
-        <w:t xml:space="preserve">            if (</w:t>
-      </w:r>
-      <w:proofErr w:type="spellStart"/>
-      <w:r>
-        <w:t>e.keyval.equals</w:t>
-      </w:r>
-      <w:proofErr w:type="spellEnd"/>
-      <w:r>
-        <w:t>(</w:t>
-      </w:r>
-      <w:proofErr w:type="spellStart"/>
-      <w:r>
-        <w:t>keyval</w:t>
-      </w:r>
-      <w:proofErr w:type="spellEnd"/>
-      <w:r>
-        <w:t>)) {</w:t>
-      </w:r>
-    </w:p>
-    <w:p>
-      <w:r>
-        <w:t xml:space="preserve">                </w:t>
-      </w:r>
-      <w:proofErr w:type="spellStart"/>
-      <w:r>
-        <w:t>e.value</w:t>
-      </w:r>
-      <w:proofErr w:type="spellEnd"/>
-      <w:r>
-        <w:t xml:space="preserve"> = value;</w:t>
+        <w:t xml:space="preserve">            if (e.keyval.equals(keyval)) {</w:t>
+      </w:r>
+    </w:p>
+    <w:p>
+      <w:r>
+        <w:t xml:space="preserve">                e.value = value;</w:t>
       </w:r>
     </w:p>
     <w:p>
@@ -162,15 +101,7 @@
     <w:p/>
     <w:p>
       <w:r>
-        <w:t xml:space="preserve">        data[index].add(new Entry(</w:t>
-      </w:r>
-      <w:proofErr w:type="spellStart"/>
-      <w:r>
-        <w:t>keyval</w:t>
-      </w:r>
-      <w:proofErr w:type="spellEnd"/>
-      <w:r>
-        <w:t>, value));</w:t>
+        <w:t xml:space="preserve">        data[index].add(new Entry(keyval, value));</w:t>
       </w:r>
     </w:p>
     <w:p>
@@ -186,15 +117,7 @@
     </w:p>
     <w:p>
       <w:r>
-        <w:t xml:space="preserve">        String </w:t>
-      </w:r>
-      <w:proofErr w:type="spellStart"/>
-      <w:r>
-        <w:t>keyval</w:t>
-      </w:r>
-      <w:proofErr w:type="spellEnd"/>
-      <w:r>
-        <w:t>;</w:t>
+        <w:t xml:space="preserve">        String keyval;</w:t>
       </w:r>
     </w:p>
     <w:p>
@@ -205,28 +128,12 @@
     <w:p/>
     <w:p>
       <w:r>
-        <w:t xml:space="preserve">        Entry(String </w:t>
-      </w:r>
-      <w:proofErr w:type="spellStart"/>
-      <w:r>
-        <w:t>k,</w:t>
-      </w:r>
-      <w:proofErr w:type="spellEnd"/>
-      <w:r>
-        <w:t xml:space="preserve"> int v) {</w:t>
-      </w:r>
-    </w:p>
-    <w:p>
-      <w:r>
-        <w:t xml:space="preserve">            </w:t>
-      </w:r>
-      <w:proofErr w:type="spellStart"/>
-      <w:r>
-        <w:t>keyval</w:t>
-      </w:r>
-      <w:proofErr w:type="spellEnd"/>
-      <w:r>
-        <w:t xml:space="preserve"> = k;</w:t>
+        <w:t xml:space="preserve">        Entry(String k, int v) {</w:t>
+      </w:r>
+    </w:p>
+    <w:p>
+      <w:r>
+        <w:t xml:space="preserve">            keyval = k;</w:t>
       </w:r>
     </w:p>
     <w:p>
@@ -264,13 +171,7 @@
     </w:p>
     <w:p>
       <w:r>
-        <w:t>1)</w:t>
-      </w:r>
-      <w:r>
-        <w:t>to fill collisions is it linear probing with backtracking</w:t>
-      </w:r>
-      <w:r>
-        <w:t xml:space="preserve"> </w:t>
+        <w:t xml:space="preserve">1)to fill collisions is it linear probing with backtracking </w:t>
       </w:r>
     </w:p>
     <w:p>
@@ -280,51 +181,27 @@
     </w:p>
     <w:p>
       <w:r>
-        <w:t>2)</w:t>
-      </w:r>
-      <w:r>
-        <w:t>Opening address by placing values at next available bucket</w:t>
-      </w:r>
-      <w:r>
-        <w:t xml:space="preserve"> </w:t>
-      </w:r>
-    </w:p>
-    <w:p>
-      <w:r>
-        <w:t>o</w:t>
-      </w:r>
-      <w:r>
-        <w:t>r</w:t>
-      </w:r>
-      <w:r>
-        <w:t xml:space="preserve"> </w:t>
-      </w:r>
-    </w:p>
-    <w:p>
-      <w:r>
-        <w:t>3)</w:t>
-      </w:r>
-      <w:r>
-        <w:t>at each index chaining using a linked list</w:t>
-      </w:r>
-      <w:r>
-        <w:t xml:space="preserve"> </w:t>
-      </w:r>
-    </w:p>
-    <w:p>
-      <w:r>
-        <w:t>or</w:t>
-      </w:r>
-      <w:r>
-        <w:t xml:space="preserve"> </w:t>
-      </w:r>
-    </w:p>
-    <w:p>
-      <w:r>
-        <w:t>4)</w:t>
-      </w:r>
-      <w:r>
-        <w:t>on each collision resizing hash table</w:t>
+        <w:t xml:space="preserve">2)Opening address by placing values at next available bucket </w:t>
+      </w:r>
+    </w:p>
+    <w:p>
+      <w:r>
+        <w:t xml:space="preserve">or </w:t>
+      </w:r>
+    </w:p>
+    <w:p>
+      <w:r>
+        <w:t xml:space="preserve">3)at each index chaining using a linked list </w:t>
+      </w:r>
+    </w:p>
+    <w:p>
+      <w:r>
+        <w:t xml:space="preserve">or </w:t>
+      </w:r>
+    </w:p>
+    <w:p>
+      <w:r>
+        <w:t>4)on each collision resizing hash table</w:t>
       </w:r>
       <w:r>
         <w:t>.</w:t>
@@ -373,7 +250,7 @@
                     <pic:cNvPicPr/>
                   </pic:nvPicPr>
                   <pic:blipFill>
-                    <a:blip r:embed="rId4"/>
+                    <a:blip r:embed="rId5"/>
                     <a:stretch>
                       <a:fillRect/>
                     </a:stretch>
@@ -416,7 +293,7 @@
                     <pic:cNvPicPr/>
                   </pic:nvPicPr>
                   <pic:blipFill>
-                    <a:blip r:embed="rId5"/>
+                    <a:blip r:embed="rId6"/>
                     <a:stretch>
                       <a:fillRect/>
                     </a:stretch>
@@ -439,138 +316,14 @@
     </w:p>
     <w:p>
       <w:r>
+        <w:rPr>
+          <w:noProof/>
+        </w:rPr>
         <w:drawing>
           <wp:inline distT="0" distB="0" distL="0" distR="0" wp14:anchorId="325423F7" wp14:editId="575A0E02">
             <wp:extent cx="5943600" cy="896620"/>
             <wp:effectExtent l="0" t="0" r="0" b="0"/>
             <wp:docPr id="6" name="Picture 6"/>
-            <wp:cNvGraphicFramePr>
-              <a:graphicFrameLocks xmlns:a="http://schemas.openxmlformats.org/drawingml/2006/main" noChangeAspect="1"/>
-            </wp:cNvGraphicFramePr>
-            <a:graphic xmlns:a="http://schemas.openxmlformats.org/drawingml/2006/main">
-              <a:graphicData uri="http://schemas.openxmlformats.org/drawingml/2006/picture">
-                <pic:pic xmlns:pic="http://schemas.openxmlformats.org/drawingml/2006/picture">
-                  <pic:nvPicPr>
-                    <pic:cNvPr id="1" name=""/>
-                    <pic:cNvPicPr/>
-                  </pic:nvPicPr>
-                  <pic:blipFill>
-                    <a:blip r:embed="rId6"/>
-                    <a:stretch>
-                      <a:fillRect/>
-                    </a:stretch>
-                  </pic:blipFill>
-                  <pic:spPr>
-                    <a:xfrm>
-                      <a:off x="0" y="0"/>
-                      <a:ext cx="5943600" cy="896620"/>
-                    </a:xfrm>
-                    <a:prstGeom prst="rect">
-                      <a:avLst/>
-                    </a:prstGeom>
-                  </pic:spPr>
-                </pic:pic>
-              </a:graphicData>
-            </a:graphic>
-          </wp:inline>
-        </w:drawing>
-      </w:r>
-    </w:p>
-    <w:p/>
-    <w:p/>
-    <w:p/>
-    <w:p>
-      <w:r>
-        <w:lastRenderedPageBreak/>
-        <w:t>Task 02:</w:t>
-      </w:r>
-      <w:r>
-        <w:t xml:space="preserve">  </w:t>
-      </w:r>
-      <w:proofErr w:type="spellStart"/>
-      <w:r>
-        <w:t>Wap</w:t>
-      </w:r>
-      <w:proofErr w:type="spellEnd"/>
-      <w:r>
-        <w:t xml:space="preserve"> to take input from the user a 5 digit no and display digit by digit in the output</w:t>
-      </w:r>
-      <w:r>
-        <w:t>.</w:t>
-      </w:r>
-    </w:p>
-    <w:p/>
-    <w:p>
-      <w:r>
-        <w:t>Hint:</w:t>
-      </w:r>
-    </w:p>
-    <w:p>
-      <w:r>
-        <w:t>If input is  456897</w:t>
-      </w:r>
-    </w:p>
-    <w:p>
-      <w:r>
-        <w:t>Output:</w:t>
-      </w:r>
-    </w:p>
-    <w:p>
-      <w:r>
-        <w:t xml:space="preserve">units digit is 7 </w:t>
-      </w:r>
-    </w:p>
-    <w:p>
-      <w:proofErr w:type="spellStart"/>
-      <w:r>
-        <w:t>Ones</w:t>
-      </w:r>
-      <w:proofErr w:type="spellEnd"/>
-      <w:r>
-        <w:t xml:space="preserve"> digit is 9</w:t>
-      </w:r>
-    </w:p>
-    <w:p>
-      <w:r>
-        <w:t>Hundreds digit is 8</w:t>
-      </w:r>
-    </w:p>
-    <w:p>
-      <w:r>
-        <w:t>Thousands digit is 6</w:t>
-      </w:r>
-    </w:p>
-    <w:p>
-      <w:r>
-        <w:t>10 thousands digit is 5</w:t>
-      </w:r>
-    </w:p>
-    <w:p>
-      <w:r>
-        <w:t>Lakhs digit is 4</w:t>
-      </w:r>
-    </w:p>
-    <w:p>
-      <w:pPr>
-        <w:rPr>
-          <w:noProof/>
-        </w:rPr>
-      </w:pPr>
-      <w:r>
-        <w:t>Solution :</w:t>
-      </w:r>
-      <w:r>
-        <w:rPr>
-          <w:noProof/>
-        </w:rPr>
-        <w:t xml:space="preserve"> </w:t>
-      </w:r>
-      <w:r>
-        <w:drawing>
-          <wp:inline distT="0" distB="0" distL="0" distR="0" wp14:anchorId="6303FEF5" wp14:editId="0E39CB25">
-            <wp:extent cx="5943600" cy="3058160"/>
-            <wp:effectExtent l="0" t="0" r="0" b="8890"/>
-            <wp:docPr id="1" name="Picture 1"/>
             <wp:cNvGraphicFramePr>
               <a:graphicFrameLocks xmlns:a="http://schemas.openxmlformats.org/drawingml/2006/main" noChangeAspect="1"/>
             </wp:cNvGraphicFramePr>
@@ -590,7 +343,7 @@
                   <pic:spPr>
                     <a:xfrm>
                       <a:off x="0" y="0"/>
-                      <a:ext cx="5943600" cy="3058160"/>
+                      <a:ext cx="5943600" cy="896620"/>
                     </a:xfrm>
                     <a:prstGeom prst="rect">
                       <a:avLst/>
@@ -603,13 +356,88 @@
         </w:drawing>
       </w:r>
     </w:p>
-    <w:p>
-      <w:r>
+    <w:p/>
+    <w:p/>
+    <w:p/>
+    <w:p>
+      <w:r>
+        <w:lastRenderedPageBreak/>
+        <w:t>Task 02:  Wap to take input from the user a 5 digit no and display digit by digit in the output</w:t>
+      </w:r>
+      <w:r>
+        <w:t>.</w:t>
+      </w:r>
+    </w:p>
+    <w:p/>
+    <w:p>
+      <w:r>
+        <w:t>Hint:</w:t>
+      </w:r>
+    </w:p>
+    <w:p>
+      <w:r>
+        <w:t>If input is  456897</w:t>
+      </w:r>
+    </w:p>
+    <w:p>
+      <w:r>
+        <w:t>Output:</w:t>
+      </w:r>
+    </w:p>
+    <w:p>
+      <w:r>
+        <w:t xml:space="preserve">units digit is 7 </w:t>
+      </w:r>
+    </w:p>
+    <w:p>
+      <w:r>
+        <w:t>Ones digit is 9</w:t>
+      </w:r>
+    </w:p>
+    <w:p>
+      <w:r>
+        <w:t>Hundreds digit is 8</w:t>
+      </w:r>
+    </w:p>
+    <w:p>
+      <w:r>
+        <w:t>Thousands digit is 6</w:t>
+      </w:r>
+    </w:p>
+    <w:p>
+      <w:r>
+        <w:t>10 thousands digit is 5</w:t>
+      </w:r>
+    </w:p>
+    <w:p>
+      <w:r>
+        <w:t>Lakhs digit is 4</w:t>
+      </w:r>
+    </w:p>
+    <w:p>
+      <w:pPr>
+        <w:rPr>
+          <w:noProof/>
+        </w:rPr>
+      </w:pPr>
+      <w:r>
+        <w:t>Solution :</w:t>
+      </w:r>
+      <w:r>
+        <w:rPr>
+          <w:noProof/>
+        </w:rPr>
+        <w:t xml:space="preserve"> </w:t>
+      </w:r>
+      <w:r>
+        <w:rPr>
+          <w:noProof/>
+        </w:rPr>
         <w:drawing>
-          <wp:inline distT="0" distB="0" distL="0" distR="0" wp14:anchorId="194DD0D1" wp14:editId="222D87FA">
-            <wp:extent cx="5943600" cy="1004570"/>
-            <wp:effectExtent l="0" t="0" r="0" b="5080"/>
-            <wp:docPr id="9" name="Picture 9"/>
+          <wp:inline distT="0" distB="0" distL="0" distR="0" wp14:anchorId="6303FEF5" wp14:editId="0E39CB25">
+            <wp:extent cx="5943600" cy="3058160"/>
+            <wp:effectExtent l="0" t="0" r="0" b="8890"/>
+            <wp:docPr id="1" name="Picture 1"/>
             <wp:cNvGraphicFramePr>
               <a:graphicFrameLocks xmlns:a="http://schemas.openxmlformats.org/drawingml/2006/main" noChangeAspect="1"/>
             </wp:cNvGraphicFramePr>
@@ -629,7 +457,7 @@
                   <pic:spPr>
                     <a:xfrm>
                       <a:off x="0" y="0"/>
-                      <a:ext cx="5943600" cy="1004570"/>
+                      <a:ext cx="5943600" cy="3058160"/>
                     </a:xfrm>
                     <a:prstGeom prst="rect">
                       <a:avLst/>
@@ -642,72 +470,16 @@
         </w:drawing>
       </w:r>
     </w:p>
-    <w:p/>
-    <w:p/>
-    <w:p>
-      <w:r>
-        <w:lastRenderedPageBreak/>
-        <w:t>Task 03:</w:t>
-      </w:r>
-      <w:r>
-        <w:t xml:space="preserve"> </w:t>
-      </w:r>
-      <w:proofErr w:type="spellStart"/>
-      <w:r>
-        <w:t>Wap</w:t>
-      </w:r>
-      <w:proofErr w:type="spellEnd"/>
-      <w:r>
-        <w:t xml:space="preserve"> to take number from the user and display the no of digit it has</w:t>
-      </w:r>
-    </w:p>
-    <w:p>
-      <w:r>
-        <w:t>H</w:t>
-      </w:r>
-      <w:r>
-        <w:t>i</w:t>
-      </w:r>
-      <w:r>
-        <w:t>nt:</w:t>
-      </w:r>
-      <w:r>
-        <w:t xml:space="preserve"> </w:t>
-      </w:r>
-      <w:r>
-        <w:t>If input is:</w:t>
-      </w:r>
-      <w:r>
-        <w:t xml:space="preserve"> </w:t>
-      </w:r>
-      <w:r>
-        <w:t>10,000</w:t>
-      </w:r>
-      <w:r>
-        <w:t xml:space="preserve"> &amp; </w:t>
-      </w:r>
-      <w:r>
-        <w:t>Output:</w:t>
-      </w:r>
-      <w:r>
-        <w:t xml:space="preserve"> </w:t>
-      </w:r>
-      <w:r>
-        <w:t>Its a 5 digit number</w:t>
-      </w:r>
-    </w:p>
-    <w:p>
-      <w:r>
-        <w:t>Solution :</w:t>
-      </w:r>
-    </w:p>
-    <w:p>
-      <w:r>
+    <w:p>
+      <w:r>
+        <w:rPr>
+          <w:noProof/>
+        </w:rPr>
         <w:drawing>
-          <wp:inline distT="0" distB="0" distL="0" distR="0" wp14:anchorId="3FE72F7A" wp14:editId="2A3CEBD4">
-            <wp:extent cx="5943600" cy="5154930"/>
-            <wp:effectExtent l="0" t="0" r="0" b="7620"/>
-            <wp:docPr id="5" name="Picture 5"/>
+          <wp:inline distT="0" distB="0" distL="0" distR="0" wp14:anchorId="194DD0D1" wp14:editId="222D87FA">
+            <wp:extent cx="5943600" cy="1004570"/>
+            <wp:effectExtent l="0" t="0" r="0" b="5080"/>
+            <wp:docPr id="9" name="Picture 9"/>
             <wp:cNvGraphicFramePr>
               <a:graphicFrameLocks xmlns:a="http://schemas.openxmlformats.org/drawingml/2006/main" noChangeAspect="1"/>
             </wp:cNvGraphicFramePr>
@@ -727,7 +499,7 @@
                   <pic:spPr>
                     <a:xfrm>
                       <a:off x="0" y="0"/>
-                      <a:ext cx="5943600" cy="5154930"/>
+                      <a:ext cx="5943600" cy="1004570"/>
                     </a:xfrm>
                     <a:prstGeom prst="rect">
                       <a:avLst/>
@@ -740,13 +512,58 @@
         </w:drawing>
       </w:r>
     </w:p>
-    <w:p>
-      <w:r>
+    <w:p/>
+    <w:p/>
+    <w:p>
+      <w:r>
+        <w:lastRenderedPageBreak/>
+        <w:t>Task 03: Wap to take number from the user and display the no of digit it has</w:t>
+      </w:r>
+    </w:p>
+    <w:p>
+      <w:r>
+        <w:t>Hint:</w:t>
+      </w:r>
+      <w:r>
+        <w:t xml:space="preserve"> </w:t>
+      </w:r>
+      <w:r>
+        <w:t>If input is:</w:t>
+      </w:r>
+      <w:r>
+        <w:t xml:space="preserve"> </w:t>
+      </w:r>
+      <w:r>
+        <w:t>10,000</w:t>
+      </w:r>
+      <w:r>
+        <w:t xml:space="preserve"> &amp; </w:t>
+      </w:r>
+      <w:r>
+        <w:t>Output:</w:t>
+      </w:r>
+      <w:r>
+        <w:t xml:space="preserve"> </w:t>
+      </w:r>
+      <w:r>
+        <w:t>Its a 5 digit number</w:t>
+      </w:r>
+    </w:p>
+    <w:p>
+      <w:r>
+        <w:t>Solution :</w:t>
+      </w:r>
+    </w:p>
+    <w:p>
+      <w:r>
+        <w:rPr>
+          <w:noProof/>
+        </w:rPr>
         <w:drawing>
-          <wp:inline distT="0" distB="0" distL="0" distR="0" wp14:anchorId="0F03BF33" wp14:editId="6D3D31E6">
-            <wp:extent cx="5943600" cy="1010285"/>
-            <wp:effectExtent l="0" t="0" r="0" b="0"/>
-            <wp:docPr id="10" name="Picture 10"/>
+          <wp:inline distT="0" distB="0" distL="0" distR="0" wp14:anchorId="3FE72F7A" wp14:editId="2A3CEBD4">
+            <wp:extent cx="5943600" cy="5154930"/>
+            <wp:effectExtent l="0" t="0" r="0" b="7620"/>
+            <wp:docPr id="5" name="Picture 5"/>
             <wp:cNvGraphicFramePr>
               <a:graphicFrameLocks xmlns:a="http://schemas.openxmlformats.org/drawingml/2006/main" noChangeAspect="1"/>
             </wp:cNvGraphicFramePr>
@@ -766,7 +583,7 @@
                   <pic:spPr>
                     <a:xfrm>
                       <a:off x="0" y="0"/>
-                      <a:ext cx="5943600" cy="1010285"/>
+                      <a:ext cx="5943600" cy="5154930"/>
                     </a:xfrm>
                     <a:prstGeom prst="rect">
                       <a:avLst/>
@@ -779,80 +596,16 @@
         </w:drawing>
       </w:r>
     </w:p>
-    <w:p/>
-    <w:p/>
-    <w:p>
-      <w:r>
-        <w:t>Task 04:</w:t>
-      </w:r>
-      <w:r>
-        <w:t xml:space="preserve"> </w:t>
-      </w:r>
-      <w:proofErr w:type="spellStart"/>
-      <w:r>
-        <w:t>Wap</w:t>
-      </w:r>
-      <w:proofErr w:type="spellEnd"/>
-      <w:r>
-        <w:t xml:space="preserve"> to display the groups of digits depending upon the unit digits </w:t>
-      </w:r>
-    </w:p>
-    <w:p>
-      <w:proofErr w:type="spellStart"/>
-      <w:r>
-        <w:lastRenderedPageBreak/>
-        <w:t>Hint:</w:t>
-      </w:r>
-      <w:proofErr w:type="spellEnd"/>
-    </w:p>
-    <w:p>
-      <w:proofErr w:type="spellStart"/>
-      <w:r>
-        <w:t>If</w:t>
-      </w:r>
-      <w:proofErr w:type="spellEnd"/>
-      <w:r>
-        <w:t xml:space="preserve"> input is 45,81, 85,100,20. 95,60,10,21</w:t>
-      </w:r>
-    </w:p>
-    <w:p>
-      <w:r>
-        <w:t xml:space="preserve">Output: </w:t>
-      </w:r>
-    </w:p>
-    <w:p>
-      <w:r>
-        <w:t xml:space="preserve">Array 1 has : 100,20,60,10  </w:t>
-      </w:r>
-    </w:p>
-    <w:p>
-      <w:r>
-        <w:t>Array 2 has : 81, 21</w:t>
-      </w:r>
-    </w:p>
-    <w:p>
-      <w:r>
-        <w:t>Array 3 has : 45 , 85 ,95</w:t>
-      </w:r>
-    </w:p>
-    <w:p>
-      <w:r>
-        <w:t>Solution :</w:t>
-      </w:r>
-    </w:p>
     <w:p>
       <w:r>
         <w:rPr>
           <w:noProof/>
         </w:rPr>
-        <w:t xml:space="preserve"> </w:t>
-      </w:r>
-      <w:r>
         <w:drawing>
-          <wp:inline distT="0" distB="0" distL="0" distR="0" wp14:anchorId="7E650228" wp14:editId="7EEB7ABD">
-            <wp:extent cx="5137832" cy="6154420"/>
-            <wp:effectExtent l="0" t="0" r="5715" b="0"/>
-            <wp:docPr id="4" name="Picture 4"/>
+          <wp:inline distT="0" distB="0" distL="0" distR="0" wp14:anchorId="0F03BF33" wp14:editId="6D3D31E6">
+            <wp:extent cx="5943600" cy="1010285"/>
+            <wp:effectExtent l="0" t="0" r="0" b="0"/>
+            <wp:docPr id="10" name="Picture 10"/>
             <wp:cNvGraphicFramePr>
               <a:graphicFrameLocks xmlns:a="http://schemas.openxmlformats.org/drawingml/2006/main" noChangeAspect="1"/>
             </wp:cNvGraphicFramePr>
@@ -872,7 +625,7 @@
                   <pic:spPr>
                     <a:xfrm>
                       <a:off x="0" y="0"/>
-                      <a:ext cx="5139056" cy="6155886"/>
+                      <a:ext cx="5943600" cy="1010285"/>
                     </a:xfrm>
                     <a:prstGeom prst="rect">
                       <a:avLst/>
@@ -885,14 +638,65 @@
         </w:drawing>
       </w:r>
     </w:p>
+    <w:p/>
+    <w:p/>
+    <w:p>
+      <w:r>
+        <w:t xml:space="preserve">Task 04: Wap to display the groups of digits depending upon the unit digits </w:t>
+      </w:r>
+    </w:p>
     <w:p>
       <w:r>
         <w:lastRenderedPageBreak/>
+        <w:t>Hint:</w:t>
+      </w:r>
+    </w:p>
+    <w:p>
+      <w:r>
+        <w:t>If input is 45,81, 85,100,20. 95,60,10,21</w:t>
+      </w:r>
+    </w:p>
+    <w:p>
+      <w:r>
+        <w:t xml:space="preserve">Output: </w:t>
+      </w:r>
+    </w:p>
+    <w:p>
+      <w:r>
+        <w:t xml:space="preserve">Array 1 has : 100,20,60,10  </w:t>
+      </w:r>
+    </w:p>
+    <w:p>
+      <w:r>
+        <w:t>Array 2 has : 81, 21</w:t>
+      </w:r>
+    </w:p>
+    <w:p>
+      <w:r>
+        <w:t>Array 3 has : 45 , 85 ,95</w:t>
+      </w:r>
+    </w:p>
+    <w:p>
+      <w:r>
+        <w:t>Solution :</w:t>
+      </w:r>
+    </w:p>
+    <w:p>
+      <w:r>
+        <w:rPr>
+          <w:noProof/>
+        </w:rPr>
+        <w:t xml:space="preserve"> </w:t>
+      </w:r>
+      <w:r>
+        <w:rPr>
+          <w:noProof/>
+        </w:rPr>
         <w:drawing>
-          <wp:inline distT="0" distB="0" distL="0" distR="0" wp14:anchorId="6A64F5BB" wp14:editId="0C7D34FC">
-            <wp:extent cx="5943600" cy="725170"/>
-            <wp:effectExtent l="0" t="0" r="0" b="0"/>
-            <wp:docPr id="11" name="Picture 11"/>
+          <wp:inline distT="0" distB="0" distL="0" distR="0" wp14:anchorId="7E650228" wp14:editId="7EEB7ABD">
+            <wp:extent cx="5137832" cy="6154420"/>
+            <wp:effectExtent l="0" t="0" r="5715" b="0"/>
+            <wp:docPr id="4" name="Picture 4"/>
             <wp:cNvGraphicFramePr>
               <a:graphicFrameLocks xmlns:a="http://schemas.openxmlformats.org/drawingml/2006/main" noChangeAspect="1"/>
             </wp:cNvGraphicFramePr>
@@ -912,6 +716,49 @@
                   <pic:spPr>
                     <a:xfrm>
                       <a:off x="0" y="0"/>
+                      <a:ext cx="5139056" cy="6155886"/>
+                    </a:xfrm>
+                    <a:prstGeom prst="rect">
+                      <a:avLst/>
+                    </a:prstGeom>
+                  </pic:spPr>
+                </pic:pic>
+              </a:graphicData>
+            </a:graphic>
+          </wp:inline>
+        </w:drawing>
+      </w:r>
+    </w:p>
+    <w:p>
+      <w:r>
+        <w:rPr>
+          <w:noProof/>
+        </w:rPr>
+        <w:lastRenderedPageBreak/>
+        <w:drawing>
+          <wp:inline distT="0" distB="0" distL="0" distR="0" wp14:anchorId="6A64F5BB" wp14:editId="0C7D34FC">
+            <wp:extent cx="5943600" cy="725170"/>
+            <wp:effectExtent l="0" t="0" r="0" b="0"/>
+            <wp:docPr id="11" name="Picture 11"/>
+            <wp:cNvGraphicFramePr>
+              <a:graphicFrameLocks xmlns:a="http://schemas.openxmlformats.org/drawingml/2006/main" noChangeAspect="1"/>
+            </wp:cNvGraphicFramePr>
+            <a:graphic xmlns:a="http://schemas.openxmlformats.org/drawingml/2006/main">
+              <a:graphicData uri="http://schemas.openxmlformats.org/drawingml/2006/picture">
+                <pic:pic xmlns:pic="http://schemas.openxmlformats.org/drawingml/2006/picture">
+                  <pic:nvPicPr>
+                    <pic:cNvPr id="1" name=""/>
+                    <pic:cNvPicPr/>
+                  </pic:nvPicPr>
+                  <pic:blipFill>
+                    <a:blip r:embed="rId13"/>
+                    <a:stretch>
+                      <a:fillRect/>
+                    </a:stretch>
+                  </pic:blipFill>
+                  <pic:spPr>
+                    <a:xfrm>
+                      <a:off x="0" y="0"/>
                       <a:ext cx="5943600" cy="725170"/>
                     </a:xfrm>
                     <a:prstGeom prst="rect">
@@ -992,26 +839,13 @@
     </w:p>
     <w:p>
       <w:r>
-        <w:t xml:space="preserve">2. for </w:t>
-      </w:r>
-      <w:proofErr w:type="spellStart"/>
-      <w:r>
-        <w:t>i</w:t>
-      </w:r>
-      <w:proofErr w:type="spellEnd"/>
-      <w:r>
-        <w:t xml:space="preserve"> = 1 to d do</w:t>
-      </w:r>
-    </w:p>
-    <w:p>
-      <w:r>
-        <w:t xml:space="preserve">3.     use a stable sort (like counting sort) to sort array A on digit </w:t>
-      </w:r>
-      <w:proofErr w:type="spellStart"/>
-      <w:r>
-        <w:t>i</w:t>
-      </w:r>
-      <w:proofErr w:type="spellEnd"/>
+        <w:t>2. for i = 1 to d do</w:t>
+      </w:r>
+    </w:p>
+    <w:p>
+      <w:r>
+        <w:t>3.     use a stable sort (like counting sort) to sort array A on digit i</w:t>
+      </w:r>
     </w:p>
     <w:p>
       <w:r>
@@ -1036,15 +870,7 @@
     </w:p>
     <w:p>
       <w:r>
-        <w:t>3. Modify C so that each C[</w:t>
-      </w:r>
-      <w:proofErr w:type="spellStart"/>
-      <w:r>
-        <w:t>i</w:t>
-      </w:r>
-      <w:proofErr w:type="spellEnd"/>
-      <w:r>
-        <w:t>] contains the actual position of this digit in output array</w:t>
+        <w:t>3. Modify C so that each C[i] contains the actual position of this digit in output array</w:t>
       </w:r>
     </w:p>
     <w:p>
@@ -1099,7 +925,7 @@
                     <pic:cNvPicPr/>
                   </pic:nvPicPr>
                   <pic:blipFill>
-                    <a:blip r:embed="rId13"/>
+                    <a:blip r:embed="rId14"/>
                     <a:stretch>
                       <a:fillRect/>
                     </a:stretch>
@@ -1125,6 +951,9 @@
         <w:t xml:space="preserve"> </w:t>
       </w:r>
       <w:r>
+        <w:rPr>
+          <w:noProof/>
+        </w:rPr>
         <w:drawing>
           <wp:inline distT="0" distB="0" distL="0" distR="0" wp14:anchorId="39FD40FD" wp14:editId="18D82EC1">
             <wp:extent cx="4586491" cy="3261995"/>
@@ -1141,7 +970,7 @@
                     <pic:cNvPicPr/>
                   </pic:nvPicPr>
                   <pic:blipFill>
-                    <a:blip r:embed="rId14"/>
+                    <a:blip r:embed="rId15"/>
                     <a:stretch>
                       <a:fillRect/>
                     </a:stretch>
@@ -1165,30 +994,13 @@
     <w:p>
       <w:r>
         <w:lastRenderedPageBreak/>
-        <w:t>Task 08:</w:t>
-      </w:r>
-      <w:r>
-        <w:t xml:space="preserve"> </w:t>
-      </w:r>
-      <w:r>
-        <w:t xml:space="preserve">Do you find any significance change between the </w:t>
-      </w:r>
-      <w:proofErr w:type="spellStart"/>
-      <w:r>
-        <w:t>breadthFirstSearchRecursive</w:t>
-      </w:r>
-      <w:proofErr w:type="spellEnd"/>
-      <w:r>
-        <w:t>() approach compared to the standard BFS?</w:t>
-      </w:r>
-    </w:p>
-    <w:p/>
-    <w:p>
-      <w:r>
-        <w:t>a)</w:t>
-      </w:r>
-      <w:r>
-        <w:t>Will it the need for queues entirely by using a stack-based recursion?</w:t>
+        <w:t>Task 08: Do you find any significance change between the breadthFirstSearchRecursive() approach compared to the standard BFS?</w:t>
+      </w:r>
+    </w:p>
+    <w:p/>
+    <w:p>
+      <w:r>
+        <w:t>a)Will it the need for queues entirely by using a stack-based recursion?</w:t>
       </w:r>
       <w:r>
         <w:tab/>
@@ -1197,10 +1009,7 @@
     <w:p/>
     <w:p>
       <w:r>
-        <w:t>b)</w:t>
-      </w:r>
-      <w:r>
-        <w:t>Will it simplifies implementation by using queues implicitly within recursive function calls?</w:t>
+        <w:t>b)Will it simplifies implementation by using queues implicitly within recursive function calls?</w:t>
       </w:r>
       <w:r>
         <w:tab/>
@@ -1209,19 +1018,13 @@
     <w:p/>
     <w:p>
       <w:r>
-        <w:t>c)</w:t>
-      </w:r>
-      <w:r>
-        <w:t>will it achieve same result but emphasizes on recursive style using the same level-order logic with explicit queue management?</w:t>
-      </w:r>
-    </w:p>
-    <w:p/>
-    <w:p>
-      <w:r>
-        <w:t>d)</w:t>
-      </w:r>
-      <w:r>
-        <w:t>will it processes nodes in post-order sequence to avoid memory allocation?</w:t>
+        <w:t>c)will it achieve same result but emphasizes on recursive style using the same level-order logic with explicit queue management?</w:t>
+      </w:r>
+    </w:p>
+    <w:p/>
+    <w:p>
+      <w:r>
+        <w:t>d)will it processes nodes in post-order sequence to avoid memory allocation?</w:t>
       </w:r>
     </w:p>
     <w:p/>
@@ -1258,33 +1061,12 @@
     <w:p>
       <w:r>
         <w:lastRenderedPageBreak/>
-        <w:t>Task 09:</w:t>
-      </w:r>
-      <w:r>
-        <w:t xml:space="preserve"> </w:t>
-      </w:r>
-      <w:r>
-        <w:t xml:space="preserve">What is </w:t>
-      </w:r>
-      <w:r>
-        <w:t>memorization</w:t>
-      </w:r>
-      <w:r>
-        <w:t>?</w:t>
-      </w:r>
-      <w:r>
-        <w:t xml:space="preserve"> </w:t>
-      </w:r>
-      <w:r>
-        <w:t>Explain it &amp; provide examples.</w:t>
-      </w:r>
-    </w:p>
-    <w:p>
-      <w:r>
-        <w:t>Solution: Memorization</w:t>
-      </w:r>
-      <w:r>
-        <w:t xml:space="preserve"> is an optimization technique used to speed up programs by storing the results of expensive function calls and returning the cached result when the same inputs occur again. It is commonly used in recursive algorithms to avoid redundant calculations.</w:t>
+        <w:t>Task 09: What is memorization? Explain it &amp; provide examples.</w:t>
+      </w:r>
+    </w:p>
+    <w:p>
+      <w:r>
+        <w:t>Solution: Memorization is an optimization technique used to speed up programs by storing the results of expensive function calls and returning the cached result when the same inputs occur again. It is commonly used in recursive algorithms to avoid redundant calculations.</w:t>
       </w:r>
     </w:p>
     <w:p/>
@@ -1311,26 +1093,12 @@
     <w:p/>
     <w:p>
       <w:r>
-        <w:t xml:space="preserve">Example in Java (Fibonacci with </w:t>
-      </w:r>
-      <w:r>
-        <w:t>memorization</w:t>
-      </w:r>
-      <w:r>
-        <w:t>):</w:t>
-      </w:r>
-    </w:p>
-    <w:p>
-      <w:r>
-        <w:t xml:space="preserve">import </w:t>
-      </w:r>
-      <w:proofErr w:type="spellStart"/>
-      <w:r>
-        <w:t>java.util.HashMap</w:t>
-      </w:r>
-      <w:proofErr w:type="spellEnd"/>
-      <w:r>
-        <w:t>;</w:t>
+        <w:t>Example in Java (Fibonacci with memorization):</w:t>
+      </w:r>
+    </w:p>
+    <w:p>
+      <w:r>
+        <w:t>import java.util.HashMap;</w:t>
       </w:r>
     </w:p>
     <w:p/>
@@ -1351,23 +1119,7 @@
     </w:p>
     <w:p>
       <w:r>
-        <w:t xml:space="preserve">        if (</w:t>
-      </w:r>
-      <w:proofErr w:type="spellStart"/>
-      <w:r>
-        <w:t>memo.containsKey</w:t>
-      </w:r>
-      <w:proofErr w:type="spellEnd"/>
-      <w:r>
-        <w:t xml:space="preserve">(n)) return </w:t>
-      </w:r>
-      <w:proofErr w:type="spellStart"/>
-      <w:r>
-        <w:t>memo.get</w:t>
-      </w:r>
-      <w:proofErr w:type="spellEnd"/>
-      <w:r>
-        <w:t>(n);</w:t>
+        <w:t xml:space="preserve">        if (memo.containsKey(n)) return memo.get(n);</w:t>
       </w:r>
     </w:p>
     <w:p>
@@ -1382,15 +1134,7 @@
     </w:p>
     <w:p>
       <w:r>
-        <w:t xml:space="preserve">        </w:t>
-      </w:r>
-      <w:proofErr w:type="spellStart"/>
-      <w:r>
-        <w:t>memo.put</w:t>
-      </w:r>
-      <w:proofErr w:type="spellEnd"/>
-      <w:r>
-        <w:t>(n, result);</w:t>
+        <w:t xml:space="preserve">        memo.put(n, result);</w:t>
       </w:r>
     </w:p>
     <w:p>
@@ -1405,28 +1149,12 @@
     </w:p>
     <w:p>
       <w:r>
-        <w:t xml:space="preserve">    public static void main(String[] </w:t>
-      </w:r>
-      <w:proofErr w:type="spellStart"/>
-      <w:r>
-        <w:t>args</w:t>
-      </w:r>
-      <w:proofErr w:type="spellEnd"/>
-      <w:r>
-        <w:t>) {</w:t>
-      </w:r>
-    </w:p>
-    <w:p>
-      <w:r>
-        <w:t xml:space="preserve">        </w:t>
-      </w:r>
-      <w:proofErr w:type="spellStart"/>
-      <w:r>
-        <w:t>System.out.println</w:t>
-      </w:r>
-      <w:proofErr w:type="spellEnd"/>
-      <w:r>
-        <w:t>(fib(10)); // Output: 55</w:t>
+        <w:t xml:space="preserve">    public static void main(String[] args) {</w:t>
+      </w:r>
+    </w:p>
+    <w:p>
+      <w:r>
+        <w:t xml:space="preserve">        System.out.println(fib(10)); // Output: 55</w:t>
       </w:r>
     </w:p>
     <w:p>
@@ -1444,41 +1172,12 @@
     <w:p>
       <w:r>
         <w:lastRenderedPageBreak/>
-        <w:t>Task 10:</w:t>
-      </w:r>
-      <w:r>
-        <w:t xml:space="preserve"> </w:t>
-      </w:r>
-      <w:r>
-        <w:t>What do you understand by Dynamic Programming</w:t>
-      </w:r>
-      <w:r>
-        <w:t xml:space="preserve">. </w:t>
-      </w:r>
-      <w:r>
-        <w:t xml:space="preserve">Explain it </w:t>
-      </w:r>
-      <w:r>
-        <w:t xml:space="preserve">&amp; provide </w:t>
-      </w:r>
-      <w:r>
-        <w:t>examples.</w:t>
-      </w:r>
-    </w:p>
-    <w:p>
-      <w:r>
-        <w:t xml:space="preserve">Solution : </w:t>
-      </w:r>
-      <w:r>
-        <w:t xml:space="preserve">Dynamic Programming (DP) is a method for solving complex problems by breaking them down into simpler subproblems and solving each subproblem only once, storing their solutions (usually using a table or </w:t>
-      </w:r>
-      <w:proofErr w:type="spellStart"/>
-      <w:r>
-        <w:t>memoization</w:t>
-      </w:r>
-      <w:proofErr w:type="spellEnd"/>
-      <w:r>
-        <w:t>). It is especially useful for optimization problems with overlapping subproblems and optimal substructure.</w:t>
+        <w:t>Task 10: What do you understand by Dynamic Programming. Explain it &amp; provide examples.</w:t>
+      </w:r>
+    </w:p>
+    <w:p>
+      <w:r>
+        <w:t>Solution : Dynamic Programming (DP) is a method for solving complex problems by breaking them down into simpler subproblems and solving each subproblem only once, storing their solutions (usually using a table or memoization). It is especially useful for optimization problems with overlapping subproblems and optimal substructure.</w:t>
       </w:r>
     </w:p>
     <w:p/>
@@ -1513,65 +1212,17 @@
     </w:p>
     <w:p>
       <w:r>
-        <w:t xml:space="preserve">    public static int knapsack(int W, int[] </w:t>
-      </w:r>
-      <w:proofErr w:type="spellStart"/>
-      <w:r>
-        <w:t>wt</w:t>
-      </w:r>
-      <w:proofErr w:type="spellEnd"/>
-      <w:r>
-        <w:t xml:space="preserve">, int[] </w:t>
-      </w:r>
-      <w:proofErr w:type="spellStart"/>
-      <w:r>
-        <w:t>val</w:t>
-      </w:r>
-      <w:proofErr w:type="spellEnd"/>
-      <w:r>
-        <w:t>, int n) {</w:t>
-      </w:r>
-    </w:p>
-    <w:p>
-      <w:r>
-        <w:t xml:space="preserve">        int[][] </w:t>
-      </w:r>
-      <w:proofErr w:type="spellStart"/>
-      <w:r>
-        <w:t>dp</w:t>
-      </w:r>
-      <w:proofErr w:type="spellEnd"/>
-      <w:r>
-        <w:t xml:space="preserve"> = new int[n+1][W+1];</w:t>
-      </w:r>
-    </w:p>
-    <w:p>
-      <w:r>
-        <w:t xml:space="preserve">        for (int </w:t>
-      </w:r>
-      <w:proofErr w:type="spellStart"/>
-      <w:r>
-        <w:t>i</w:t>
-      </w:r>
-      <w:proofErr w:type="spellEnd"/>
-      <w:r>
-        <w:t xml:space="preserve"> = 0; </w:t>
-      </w:r>
-      <w:proofErr w:type="spellStart"/>
-      <w:r>
-        <w:t>i</w:t>
-      </w:r>
-      <w:proofErr w:type="spellEnd"/>
-      <w:r>
-        <w:t xml:space="preserve"> &lt;= n; </w:t>
-      </w:r>
-      <w:proofErr w:type="spellStart"/>
-      <w:r>
-        <w:t>i</w:t>
-      </w:r>
-      <w:proofErr w:type="spellEnd"/>
-      <w:r>
-        <w:t>++) {</w:t>
+        <w:t xml:space="preserve">    public static int knapsack(int W, int[] wt, int[] val, int n) {</w:t>
+      </w:r>
+    </w:p>
+    <w:p>
+      <w:r>
+        <w:t xml:space="preserve">        int[][] dp = new int[n+1][W+1];</w:t>
+      </w:r>
+    </w:p>
+    <w:p>
+      <w:r>
+        <w:t xml:space="preserve">        for (int i = 0; i &lt;= n; i++) {</w:t>
       </w:r>
     </w:p>
     <w:p>
@@ -1581,110 +1232,22 @@
     </w:p>
     <w:p>
       <w:r>
-        <w:t xml:space="preserve">                if (</w:t>
-      </w:r>
-      <w:proofErr w:type="spellStart"/>
-      <w:r>
-        <w:t>i</w:t>
-      </w:r>
-      <w:proofErr w:type="spellEnd"/>
-      <w:r>
-        <w:t xml:space="preserve"> == 0 || w == 0)</w:t>
-      </w:r>
-    </w:p>
-    <w:p>
-      <w:r>
-        <w:t xml:space="preserve">                    </w:t>
-      </w:r>
-      <w:proofErr w:type="spellStart"/>
-      <w:r>
-        <w:t>dp</w:t>
-      </w:r>
-      <w:proofErr w:type="spellEnd"/>
-      <w:r>
-        <w:t>[</w:t>
-      </w:r>
-      <w:proofErr w:type="spellStart"/>
-      <w:r>
-        <w:t>i</w:t>
-      </w:r>
-      <w:proofErr w:type="spellEnd"/>
-      <w:r>
-        <w:t>][w] = 0;</w:t>
-      </w:r>
-    </w:p>
-    <w:p>
-      <w:r>
-        <w:t xml:space="preserve">                else if (</w:t>
-      </w:r>
-      <w:proofErr w:type="spellStart"/>
-      <w:r>
-        <w:t>wt</w:t>
-      </w:r>
-      <w:proofErr w:type="spellEnd"/>
-      <w:r>
-        <w:t>[i-1] &lt;= w)</w:t>
-      </w:r>
-    </w:p>
-    <w:p>
-      <w:r>
-        <w:t xml:space="preserve">                    </w:t>
-      </w:r>
-      <w:proofErr w:type="spellStart"/>
-      <w:r>
-        <w:t>dp</w:t>
-      </w:r>
-      <w:proofErr w:type="spellEnd"/>
-      <w:r>
-        <w:t>[</w:t>
-      </w:r>
-      <w:proofErr w:type="spellStart"/>
-      <w:r>
-        <w:t>i</w:t>
-      </w:r>
-      <w:proofErr w:type="spellEnd"/>
-      <w:r>
-        <w:t xml:space="preserve">][w] = </w:t>
-      </w:r>
-      <w:proofErr w:type="spellStart"/>
-      <w:r>
-        <w:t>Math.max</w:t>
-      </w:r>
-      <w:proofErr w:type="spellEnd"/>
-      <w:r>
-        <w:t>(</w:t>
-      </w:r>
-      <w:proofErr w:type="spellStart"/>
-      <w:r>
-        <w:t>val</w:t>
-      </w:r>
-      <w:proofErr w:type="spellEnd"/>
-      <w:r>
-        <w:t xml:space="preserve">[i-1] + </w:t>
-      </w:r>
-      <w:proofErr w:type="spellStart"/>
-      <w:r>
-        <w:t>dp</w:t>
-      </w:r>
-      <w:proofErr w:type="spellEnd"/>
-      <w:r>
-        <w:t>[i-1][w-</w:t>
-      </w:r>
-      <w:proofErr w:type="spellStart"/>
-      <w:r>
-        <w:t>wt</w:t>
-      </w:r>
-      <w:proofErr w:type="spellEnd"/>
-      <w:r>
-        <w:t xml:space="preserve">[i-1]], </w:t>
-      </w:r>
-      <w:proofErr w:type="spellStart"/>
-      <w:r>
-        <w:t>dp</w:t>
-      </w:r>
-      <w:proofErr w:type="spellEnd"/>
-      <w:r>
-        <w:t>[i-1][w]);</w:t>
+        <w:t xml:space="preserve">                if (i == 0 || w == 0)</w:t>
+      </w:r>
+    </w:p>
+    <w:p>
+      <w:r>
+        <w:t xml:space="preserve">                    dp[i][w] = 0;</w:t>
+      </w:r>
+    </w:p>
+    <w:p>
+      <w:r>
+        <w:t xml:space="preserve">                else if (wt[i-1] &lt;= w)</w:t>
+      </w:r>
+    </w:p>
+    <w:p>
+      <w:r>
+        <w:t xml:space="preserve">                    dp[i][w] = Math.max(val[i-1] + dp[i-1][w-wt[i-1]], dp[i-1][w]);</w:t>
       </w:r>
     </w:p>
     <w:p>
@@ -1694,31 +1257,7 @@
     </w:p>
     <w:p>
       <w:r>
-        <w:t xml:space="preserve">                    </w:t>
-      </w:r>
-      <w:proofErr w:type="spellStart"/>
-      <w:r>
-        <w:t>dp</w:t>
-      </w:r>
-      <w:proofErr w:type="spellEnd"/>
-      <w:r>
-        <w:t>[</w:t>
-      </w:r>
-      <w:proofErr w:type="spellStart"/>
-      <w:r>
-        <w:t>i</w:t>
-      </w:r>
-      <w:proofErr w:type="spellEnd"/>
-      <w:r>
-        <w:t xml:space="preserve">][w] = </w:t>
-      </w:r>
-      <w:proofErr w:type="spellStart"/>
-      <w:r>
-        <w:t>dp</w:t>
-      </w:r>
-      <w:proofErr w:type="spellEnd"/>
-      <w:r>
-        <w:t>[i-1][w];</w:t>
+        <w:t xml:space="preserve">                    dp[i][w] = dp[i-1][w];</w:t>
       </w:r>
     </w:p>
     <w:p>
@@ -1733,15 +1272,7 @@
     </w:p>
     <w:p>
       <w:r>
-        <w:t xml:space="preserve">        return </w:t>
-      </w:r>
-      <w:proofErr w:type="spellStart"/>
-      <w:r>
-        <w:t>dp</w:t>
-      </w:r>
-      <w:proofErr w:type="spellEnd"/>
-      <w:r>
-        <w:t>[n][W];</w:t>
+        <w:t xml:space="preserve">        return dp[n][W];</w:t>
       </w:r>
     </w:p>
     <w:p>
@@ -1762,13 +1293,7 @@
         <w:t>11: Can</w:t>
       </w:r>
       <w:r>
-        <w:t xml:space="preserve"> you write </w:t>
-      </w:r>
-      <w:r>
-        <w:t>Fibonacci</w:t>
-      </w:r>
-      <w:r>
-        <w:t xml:space="preserve"> series using dynamic programming?</w:t>
+        <w:t xml:space="preserve"> you write Fibonacci series using dynamic programming?</w:t>
       </w:r>
     </w:p>
     <w:p>
@@ -1796,7 +1321,7 @@
                     <pic:cNvPicPr/>
                   </pic:nvPicPr>
                   <pic:blipFill>
-                    <a:blip r:embed="rId15"/>
+                    <a:blip r:embed="rId16"/>
                     <a:stretch>
                       <a:fillRect/>
                     </a:stretch>
@@ -1820,6 +1345,9 @@
     <w:p/>
     <w:p>
       <w:r>
+        <w:rPr>
+          <w:noProof/>
+        </w:rPr>
         <w:drawing>
           <wp:inline distT="0" distB="0" distL="0" distR="0" wp14:anchorId="41B5AE8C" wp14:editId="06B2E26D">
             <wp:extent cx="5943600" cy="685800"/>
@@ -1836,7 +1364,7 @@
                     <pic:cNvPicPr/>
                   </pic:nvPicPr>
                   <pic:blipFill>
-                    <a:blip r:embed="rId16"/>
+                    <a:blip r:embed="rId17"/>
                     <a:stretch>
                       <a:fillRect/>
                     </a:stretch>
@@ -1860,91 +1388,675 @@
     <w:p/>
     <w:p>
       <w:r>
-        <w:t>Task 12:</w:t>
+        <w:t>Task 12: How does heap sort work? explain the technique</w:t>
+      </w:r>
+    </w:p>
+    <w:p>
+      <w:r>
+        <w:t>Solution :</w:t>
+      </w:r>
+      <w:r>
+        <w:t xml:space="preserve"> Heap sort is a comparison-based sorting algorithm that uses a binary heap data structure. Here’s how it works:</w:t>
+      </w:r>
+    </w:p>
+    <w:p>
+      <w:r>
+        <w:t>Build a max heap from the input data. In a max heap, the largest element is at the root.</w:t>
+      </w:r>
+    </w:p>
+    <w:p>
+      <w:r>
+        <w:t>Swap the root (maximum value) with the last element of the heap.</w:t>
+      </w:r>
+    </w:p>
+    <w:p>
+      <w:r>
+        <w:t>Reduce the heap size by one and heapify the root to maintain the max heap property.</w:t>
+      </w:r>
+    </w:p>
+    <w:p>
+      <w:r>
+        <w:t>Repeat steps 2 and 3 until the heap size is 1.</w:t>
+      </w:r>
+    </w:p>
+    <w:p>
+      <w:r>
+        <w:t>The process ensures that the largest elements are moved to the end of the array one by one, resulting in a sorted array.</w:t>
+      </w:r>
+    </w:p>
+    <w:p/>
+    <w:p>
+      <w:r>
+        <w:t>Key points:</w:t>
+      </w:r>
+    </w:p>
+    <w:p>
+      <w:r>
+        <w:t>Heap sort has O(n log n) time complexity.</w:t>
+      </w:r>
+    </w:p>
+    <w:p>
+      <w:r>
+        <w:t>It is not a stable sort.</w:t>
+      </w:r>
+    </w:p>
+    <w:p>
+      <w:r>
+        <w:t>It sorts in place (no extra memory needed).</w:t>
+      </w:r>
+    </w:p>
+    <w:p/>
+    <w:p>
+      <w:r>
+        <w:t>Task</w:t>
+      </w:r>
+      <w:r>
+        <w:t xml:space="preserve"> 13:</w:t>
       </w:r>
       <w:r>
         <w:t xml:space="preserve"> </w:t>
       </w:r>
       <w:r>
-        <w:t xml:space="preserve">How does heap sort </w:t>
-      </w:r>
-      <w:r>
-        <w:t>work?</w:t>
-      </w:r>
-      <w:r>
-        <w:t xml:space="preserve"> explain the technique</w:t>
-      </w:r>
-    </w:p>
-    <w:p>
-      <w:r>
-        <w:t>Solution :</w:t>
+        <w:t>how can you say recursive functions maintain the state of each call during execution?</w:t>
+      </w:r>
+    </w:p>
+    <w:p>
+      <w:r>
+        <w:t>1. Each recursive call creates a new thread, and context switching maintains state.</w:t>
+      </w:r>
+    </w:p>
+    <w:p>
+      <w:r>
+        <w:t>2. Recursive functions store state in global variables accessible across calls.</w:t>
+      </w:r>
+      <w:r>
+        <w:tab/>
+      </w:r>
+    </w:p>
+    <w:p>
+      <w:r>
+        <w:t>3. The system call stack tracks local variables and return addresses for each recursive invocation.</w:t>
+      </w:r>
+    </w:p>
+    <w:p>
+      <w:r>
+        <w:t>4. Recursive functions replicate the heap structure to keep values between calls.</w:t>
+      </w:r>
+    </w:p>
+    <w:p>
+      <w:r>
+        <w:t xml:space="preserve">Solution : </w:t>
+      </w:r>
+      <w:r>
+        <w:t>The correct answer is</w:t>
+      </w:r>
+      <w:r>
+        <w:t xml:space="preserve"> t</w:t>
+      </w:r>
+      <w:r>
+        <w:t>he system call stack tracks local variables and return addresses for each recursive invocation.</w:t>
+      </w:r>
+    </w:p>
+    <w:p>
+      <w:r>
+        <w:t>Each time a recursive function is called, a new stack frame is created on the call stack, which stores the function’s local variables and the return address. This allows each recursive call to maintain its own state independently until it completes and returns.</w:t>
+      </w:r>
+    </w:p>
+    <w:p/>
+    <w:p/>
+    <w:p>
+      <w:r>
+        <w:t>Task 14:</w:t>
       </w:r>
       <w:r>
         <w:t xml:space="preserve"> </w:t>
       </w:r>
       <w:r>
-        <w:t>Heap sort is a comparison-based sorting algorithm that uses a binary heap data structure. Here’s how it works:</w:t>
-      </w:r>
-    </w:p>
-    <w:p/>
-    <w:p>
-      <w:r>
-        <w:t>Build a max heap from the input data. In a max heap, the largest element is at the root.</w:t>
-      </w:r>
-    </w:p>
-    <w:p>
-      <w:r>
-        <w:t>Swap the root (maximum value) with the last element of the heap.</w:t>
-      </w:r>
-    </w:p>
-    <w:p>
-      <w:r>
-        <w:t xml:space="preserve">Reduce the heap size by one and </w:t>
-      </w:r>
-      <w:proofErr w:type="spellStart"/>
-      <w:r>
-        <w:t>heapify</w:t>
-      </w:r>
-      <w:proofErr w:type="spellEnd"/>
-      <w:r>
-        <w:t xml:space="preserve"> the root to maintain the max heap property.</w:t>
-      </w:r>
-    </w:p>
-    <w:p>
-      <w:r>
-        <w:t>Repeat steps 2 and 3 until the heap size is 1.</w:t>
-      </w:r>
-    </w:p>
+        <w:t>Iterative implementations use less memory as they do not require stack frames for each call. True</w:t>
+      </w:r>
+      <w:r>
+        <w:t xml:space="preserve"> or False? Also, </w:t>
+      </w:r>
+      <w:r>
+        <w:t>with regard to the difference in memory usage between recursive and iterative implementations of the same algorithm</w:t>
+      </w:r>
+      <w:r>
+        <w:t xml:space="preserve">? Is </w:t>
+      </w:r>
+      <w:r>
+        <w:t>the above statement is true or false</w:t>
+      </w:r>
+      <w:r>
+        <w:t>?</w:t>
+      </w:r>
+    </w:p>
+    <w:p>
+      <w:r>
+        <w:t xml:space="preserve">Solution: </w:t>
+      </w:r>
+      <w:r>
+        <w:t>True. Iterative implementations generally use less memory than recursive ones because they do not require additional stack frames for each function call. In recursion, each call adds a new frame to the call stack, increasing memory usage, while iteration typically uses a single loop and minimal extra memory</w:t>
+      </w:r>
+    </w:p>
+    <w:p/>
+    <w:p>
+      <w:r>
+        <w:t xml:space="preserve">Task </w:t>
+      </w:r>
+      <w:r>
+        <w:t xml:space="preserve">15: </w:t>
+      </w:r>
+      <w:r>
+        <w:t>Recursion that lacks a proper base case or makes too many nested calls, exhausting the call stack. –</w:t>
+      </w:r>
+      <w:r>
+        <w:t xml:space="preserve"> is it</w:t>
+      </w:r>
+      <w:r>
+        <w:t xml:space="preserve"> true</w:t>
+      </w:r>
+      <w:r>
+        <w:t xml:space="preserve"> or false? </w:t>
+      </w:r>
+      <w:r>
+        <w:t>with regard to stack overflow error in recursive functions.</w:t>
+      </w:r>
+      <w:r>
+        <w:t xml:space="preserve"> </w:t>
+      </w:r>
+      <w:r>
+        <w:t>do you think above statement is true</w:t>
+      </w:r>
+      <w:r>
+        <w:t>?</w:t>
+      </w:r>
+    </w:p>
+    <w:p>
+      <w:r>
+        <w:t xml:space="preserve">Solution: </w:t>
+      </w:r>
+      <w:r>
+        <w:t>True. The statement is correct. A recursive function that lacks a proper base case or makes too many nested calls can exhaust the call stack, leading to a stack overflow error. Proper base cases are essential to prevent infinite recursion and stack overflows.</w:t>
+      </w:r>
+    </w:p>
+    <w:p/>
     <w:p>
       <w:r>
         <w:lastRenderedPageBreak/>
-        <w:t>The process ensures that the largest elements are moved to the end of the array one by one, resulting in a sorted array.</w:t>
-      </w:r>
-    </w:p>
-    <w:p/>
-    <w:p>
-      <w:r>
-        <w:t>Key points:</w:t>
-      </w:r>
-    </w:p>
-    <w:p/>
-    <w:p>
-      <w:r>
-        <w:t>Heap sort has O(n log n) time complexity.</w:t>
-      </w:r>
-    </w:p>
-    <w:p>
-      <w:r>
-        <w:t>It is not a stable sort.</w:t>
-      </w:r>
-    </w:p>
-    <w:p>
-      <w:r>
-        <w:t>It sorts in place (no extra memory needed).</w:t>
-      </w:r>
-    </w:p>
-    <w:p/>
-    <w:p/>
+        <w:t>Task 16:</w:t>
+      </w:r>
+      <w:r>
+        <w:t xml:space="preserve"> </w:t>
+      </w:r>
+      <w:r>
+        <w:t>what happens when inserting keys with the same hash in this custom hash map</w:t>
+      </w:r>
+    </w:p>
+    <w:p>
+      <w:r>
+        <w:t>public class HashCollision {</w:t>
+      </w:r>
+    </w:p>
+    <w:p/>
+    <w:p>
+      <w:r>
+        <w:t xml:space="preserve">     static class Entry {</w:t>
+      </w:r>
+    </w:p>
+    <w:p>
+      <w:r>
+        <w:t xml:space="preserve">        String key;</w:t>
+      </w:r>
+    </w:p>
+    <w:p>
+      <w:r>
+        <w:t xml:space="preserve">        int value;</w:t>
+      </w:r>
+    </w:p>
+    <w:p/>
+    <w:p>
+      <w:r>
+        <w:t xml:space="preserve">        Entry(String key, int value) {</w:t>
+      </w:r>
+    </w:p>
+    <w:p>
+      <w:r>
+        <w:t xml:space="preserve">            this.key = key;</w:t>
+      </w:r>
+    </w:p>
+    <w:p>
+      <w:r>
+        <w:t xml:space="preserve">            this.value = value;</w:t>
+      </w:r>
+    </w:p>
+    <w:p>
+      <w:r>
+        <w:t xml:space="preserve">        }</w:t>
+      </w:r>
+    </w:p>
+    <w:p>
+      <w:r>
+        <w:t xml:space="preserve">    }</w:t>
+      </w:r>
+    </w:p>
+    <w:p/>
+    <w:p>
+      <w:r>
+        <w:t xml:space="preserve">     List&lt;Entry&gt;[] table = new AL[10];</w:t>
+      </w:r>
+    </w:p>
+    <w:p/>
+    <w:p>
+      <w:r>
+        <w:t xml:space="preserve">     public void put(String key, int val) {</w:t>
+      </w:r>
+    </w:p>
+    <w:p>
+      <w:r>
+        <w:t xml:space="preserve">        int index = Math.abs(key.hashCode() % table.length);</w:t>
+      </w:r>
+    </w:p>
+    <w:p/>
+    <w:p>
+      <w:r>
+        <w:t xml:space="preserve">        if (table[index] == null) {</w:t>
+      </w:r>
+    </w:p>
+    <w:p>
+      <w:r>
+        <w:t xml:space="preserve">            table[index] = new AL&lt;&gt;();</w:t>
+      </w:r>
+    </w:p>
+    <w:p>
+      <w:r>
+        <w:t xml:space="preserve">        }</w:t>
+      </w:r>
+    </w:p>
+    <w:p/>
+    <w:p>
+      <w:r>
+        <w:t xml:space="preserve">        table[index].add(new Entry(key, val));</w:t>
+      </w:r>
+    </w:p>
+    <w:p>
+      <w:r>
+        <w:t xml:space="preserve">    }</w:t>
+      </w:r>
+    </w:p>
+    <w:p>
+      <w:r>
+        <w:t>}</w:t>
+      </w:r>
+    </w:p>
+    <w:p/>
+    <w:p>
+      <w:r>
+        <w:t>1. Insertion will fail due to duplicate key exception</w:t>
+      </w:r>
+      <w:r>
+        <w:tab/>
+      </w:r>
+    </w:p>
+    <w:p>
+      <w:r>
+        <w:t>2. Values are distributed across different buckets using linear probing</w:t>
+      </w:r>
+    </w:p>
+    <w:p/>
+    <w:p>
+      <w:r>
+        <w:lastRenderedPageBreak/>
+        <w:t>3. Only one key-value pair will be stored due to overwriting</w:t>
+      </w:r>
+    </w:p>
+    <w:p>
+      <w:r>
+        <w:t>4. Multiple values are stored in same bucket via chaining</w:t>
+      </w:r>
+    </w:p>
+    <w:p>
+      <w:r>
+        <w:t xml:space="preserve">Solution : </w:t>
+      </w:r>
+      <w:r>
+        <w:t>The correct answer is</w:t>
+      </w:r>
+      <w:r>
+        <w:t xml:space="preserve"> </w:t>
+      </w:r>
+      <w:r>
+        <w:t>Multiple values are stored in same bucket via chaining</w:t>
+      </w:r>
+    </w:p>
+    <w:p>
+      <w:r>
+        <w:t>Explanation:</w:t>
+      </w:r>
+    </w:p>
+    <w:p>
+      <w:r>
+        <w:t>When keys with the same hash are inserted, they map to the same index in the table. The code uses a list (chaining) at each bucket, so all entries with the same hash are added to the same list, allowing multiple key-value pairs to coexist in the same bucket.</w:t>
+      </w:r>
+    </w:p>
+    <w:p/>
+    <w:p/>
+    <w:p/>
+    <w:p>
+      <w:r>
+        <w:t>Task 17:</w:t>
+      </w:r>
+      <w:r>
+        <w:t xml:space="preserve"> </w:t>
+      </w:r>
+      <w:r>
+        <w:t>Write a code for binary search tree for expected output</w:t>
+      </w:r>
+    </w:p>
+    <w:p/>
+    <w:p>
+      <w:r>
+        <w:rPr>
+          <w:rFonts w:ascii="Arial" w:hAnsi="Arial" w:cs="Arial"/>
+          <w:noProof/>
+          <w:color w:val="000000"/>
+          <w:bdr w:val="none" w:sz="0" w:space="0" w:color="auto" w:frame="1"/>
+        </w:rPr>
+        <w:drawing>
+          <wp:inline distT="0" distB="0" distL="0" distR="0" wp14:anchorId="77D19DEC" wp14:editId="6078C36C">
+            <wp:extent cx="5943600" cy="3346450"/>
+            <wp:effectExtent l="0" t="0" r="0" b="6350"/>
+            <wp:docPr id="16" name="Picture 16"/>
+            <wp:cNvGraphicFramePr>
+              <a:graphicFrameLocks xmlns:a="http://schemas.openxmlformats.org/drawingml/2006/main" noChangeAspect="1"/>
+            </wp:cNvGraphicFramePr>
+            <a:graphic xmlns:a="http://schemas.openxmlformats.org/drawingml/2006/main">
+              <a:graphicData uri="http://schemas.openxmlformats.org/drawingml/2006/picture">
+                <pic:pic xmlns:pic="http://schemas.openxmlformats.org/drawingml/2006/picture">
+                  <pic:nvPicPr>
+                    <pic:cNvPr id="0" name="Picture 11"/>
+                    <pic:cNvPicPr>
+                      <a:picLocks noChangeAspect="1" noChangeArrowheads="1"/>
+                    </pic:cNvPicPr>
+                  </pic:nvPicPr>
+                  <pic:blipFill>
+                    <a:blip r:embed="rId18" cstate="print">
+                      <a:extLst>
+                        <a:ext uri="{28A0092B-C50C-407E-A947-70E740481C1C}">
+                          <a14:useLocalDpi xmlns:a14="http://schemas.microsoft.com/office/drawing/2010/main" val="0"/>
+                        </a:ext>
+                      </a:extLst>
+                    </a:blip>
+                    <a:srcRect/>
+                    <a:stretch>
+                      <a:fillRect/>
+                    </a:stretch>
+                  </pic:blipFill>
+                  <pic:spPr bwMode="auto">
+                    <a:xfrm>
+                      <a:off x="0" y="0"/>
+                      <a:ext cx="5943600" cy="3346450"/>
+                    </a:xfrm>
+                    <a:prstGeom prst="rect">
+                      <a:avLst/>
+                    </a:prstGeom>
+                    <a:noFill/>
+                    <a:ln>
+                      <a:noFill/>
+                    </a:ln>
+                  </pic:spPr>
+                </pic:pic>
+              </a:graphicData>
+            </a:graphic>
+          </wp:inline>
+        </w:drawing>
+      </w:r>
+    </w:p>
+    <w:p>
+      <w:r>
+        <w:rPr>
+          <w:noProof/>
+        </w:rPr>
+        <w:lastRenderedPageBreak/>
+        <w:drawing>
+          <wp:inline distT="0" distB="0" distL="0" distR="0" wp14:anchorId="3E8F4757" wp14:editId="19B0BB72">
+            <wp:extent cx="5823585" cy="8229600"/>
+            <wp:effectExtent l="0" t="0" r="5715" b="0"/>
+            <wp:docPr id="18" name="Picture 18"/>
+            <wp:cNvGraphicFramePr>
+              <a:graphicFrameLocks xmlns:a="http://schemas.openxmlformats.org/drawingml/2006/main" noChangeAspect="1"/>
+            </wp:cNvGraphicFramePr>
+            <a:graphic xmlns:a="http://schemas.openxmlformats.org/drawingml/2006/main">
+              <a:graphicData uri="http://schemas.openxmlformats.org/drawingml/2006/picture">
+                <pic:pic xmlns:pic="http://schemas.openxmlformats.org/drawingml/2006/picture">
+                  <pic:nvPicPr>
+                    <pic:cNvPr id="1" name=""/>
+                    <pic:cNvPicPr/>
+                  </pic:nvPicPr>
+                  <pic:blipFill>
+                    <a:blip r:embed="rId19"/>
+                    <a:stretch>
+                      <a:fillRect/>
+                    </a:stretch>
+                  </pic:blipFill>
+                  <pic:spPr>
+                    <a:xfrm>
+                      <a:off x="0" y="0"/>
+                      <a:ext cx="5823585" cy="8229600"/>
+                    </a:xfrm>
+                    <a:prstGeom prst="rect">
+                      <a:avLst/>
+                    </a:prstGeom>
+                  </pic:spPr>
+                </pic:pic>
+              </a:graphicData>
+            </a:graphic>
+          </wp:inline>
+        </w:drawing>
+      </w:r>
+      <w:r>
+        <w:t>\</w:t>
+      </w:r>
+    </w:p>
+    <w:p>
+      <w:r>
+        <w:rPr>
+          <w:noProof/>
+        </w:rPr>
+        <w:lastRenderedPageBreak/>
+        <w:drawing>
+          <wp:inline distT="0" distB="0" distL="0" distR="0" wp14:anchorId="2E22A39C" wp14:editId="6BE2B17F">
+            <wp:extent cx="5943600" cy="6461760"/>
+            <wp:effectExtent l="0" t="0" r="0" b="0"/>
+            <wp:docPr id="19" name="Picture 19"/>
+            <wp:cNvGraphicFramePr>
+              <a:graphicFrameLocks xmlns:a="http://schemas.openxmlformats.org/drawingml/2006/main" noChangeAspect="1"/>
+            </wp:cNvGraphicFramePr>
+            <a:graphic xmlns:a="http://schemas.openxmlformats.org/drawingml/2006/main">
+              <a:graphicData uri="http://schemas.openxmlformats.org/drawingml/2006/picture">
+                <pic:pic xmlns:pic="http://schemas.openxmlformats.org/drawingml/2006/picture">
+                  <pic:nvPicPr>
+                    <pic:cNvPr id="1" name=""/>
+                    <pic:cNvPicPr/>
+                  </pic:nvPicPr>
+                  <pic:blipFill>
+                    <a:blip r:embed="rId20"/>
+                    <a:stretch>
+                      <a:fillRect/>
+                    </a:stretch>
+                  </pic:blipFill>
+                  <pic:spPr>
+                    <a:xfrm>
+                      <a:off x="0" y="0"/>
+                      <a:ext cx="5943600" cy="6461760"/>
+                    </a:xfrm>
+                    <a:prstGeom prst="rect">
+                      <a:avLst/>
+                    </a:prstGeom>
+                  </pic:spPr>
+                </pic:pic>
+              </a:graphicData>
+            </a:graphic>
+          </wp:inline>
+        </w:drawing>
+      </w:r>
+    </w:p>
+    <w:p/>
+    <w:p/>
+    <w:p/>
+    <w:p/>
+    <w:p/>
+    <w:p/>
+    <w:p>
+      <w:r>
+        <w:lastRenderedPageBreak/>
+        <w:t xml:space="preserve">Task 18 : </w:t>
+      </w:r>
+      <w:r>
+        <w:t>Print reverse order for alternative levels..</w:t>
+      </w:r>
+    </w:p>
+    <w:p>
+      <w:r>
+        <w:rPr>
+          <w:rFonts w:ascii="Arial" w:hAnsi="Arial" w:cs="Arial"/>
+          <w:noProof/>
+          <w:color w:val="000000"/>
+          <w:bdr w:val="none" w:sz="0" w:space="0" w:color="auto" w:frame="1"/>
+        </w:rPr>
+        <w:drawing>
+          <wp:inline distT="0" distB="0" distL="0" distR="0" wp14:anchorId="7A57C6C8" wp14:editId="7DDC5437">
+            <wp:extent cx="5943600" cy="3346450"/>
+            <wp:effectExtent l="0" t="0" r="0" b="6350"/>
+            <wp:docPr id="17" name="Picture 17"/>
+            <wp:cNvGraphicFramePr>
+              <a:graphicFrameLocks xmlns:a="http://schemas.openxmlformats.org/drawingml/2006/main" noChangeAspect="1"/>
+            </wp:cNvGraphicFramePr>
+            <a:graphic xmlns:a="http://schemas.openxmlformats.org/drawingml/2006/main">
+              <a:graphicData uri="http://schemas.openxmlformats.org/drawingml/2006/picture">
+                <pic:pic xmlns:pic="http://schemas.openxmlformats.org/drawingml/2006/picture">
+                  <pic:nvPicPr>
+                    <pic:cNvPr id="0" name="Picture 13"/>
+                    <pic:cNvPicPr>
+                      <a:picLocks noChangeAspect="1" noChangeArrowheads="1"/>
+                    </pic:cNvPicPr>
+                  </pic:nvPicPr>
+                  <pic:blipFill>
+                    <a:blip r:embed="rId21" cstate="print">
+                      <a:extLst>
+                        <a:ext uri="{28A0092B-C50C-407E-A947-70E740481C1C}">
+                          <a14:useLocalDpi xmlns:a14="http://schemas.microsoft.com/office/drawing/2010/main" val="0"/>
+                        </a:ext>
+                      </a:extLst>
+                    </a:blip>
+                    <a:srcRect/>
+                    <a:stretch>
+                      <a:fillRect/>
+                    </a:stretch>
+                  </pic:blipFill>
+                  <pic:spPr bwMode="auto">
+                    <a:xfrm>
+                      <a:off x="0" y="0"/>
+                      <a:ext cx="5943600" cy="3346450"/>
+                    </a:xfrm>
+                    <a:prstGeom prst="rect">
+                      <a:avLst/>
+                    </a:prstGeom>
+                    <a:noFill/>
+                    <a:ln>
+                      <a:noFill/>
+                    </a:ln>
+                  </pic:spPr>
+                </pic:pic>
+              </a:graphicData>
+            </a:graphic>
+          </wp:inline>
+        </w:drawing>
+      </w:r>
+    </w:p>
+    <w:p/>
+    <w:p>
+      <w:r>
+        <w:lastRenderedPageBreak/>
+        <w:drawing>
+          <wp:inline distT="0" distB="0" distL="0" distR="0" wp14:anchorId="12132D6A" wp14:editId="48FCAFD0">
+            <wp:extent cx="5943600" cy="4290695"/>
+            <wp:effectExtent l="0" t="0" r="0" b="0"/>
+            <wp:docPr id="20" name="Picture 20"/>
+            <wp:cNvGraphicFramePr>
+              <a:graphicFrameLocks xmlns:a="http://schemas.openxmlformats.org/drawingml/2006/main" noChangeAspect="1"/>
+            </wp:cNvGraphicFramePr>
+            <a:graphic xmlns:a="http://schemas.openxmlformats.org/drawingml/2006/main">
+              <a:graphicData uri="http://schemas.openxmlformats.org/drawingml/2006/picture">
+                <pic:pic xmlns:pic="http://schemas.openxmlformats.org/drawingml/2006/picture">
+                  <pic:nvPicPr>
+                    <pic:cNvPr id="1" name=""/>
+                    <pic:cNvPicPr/>
+                  </pic:nvPicPr>
+                  <pic:blipFill>
+                    <a:blip r:embed="rId22"/>
+                    <a:stretch>
+                      <a:fillRect/>
+                    </a:stretch>
+                  </pic:blipFill>
+                  <pic:spPr>
+                    <a:xfrm>
+                      <a:off x="0" y="0"/>
+                      <a:ext cx="5943600" cy="4290695"/>
+                    </a:xfrm>
+                    <a:prstGeom prst="rect">
+                      <a:avLst/>
+                    </a:prstGeom>
+                  </pic:spPr>
+                </pic:pic>
+              </a:graphicData>
+            </a:graphic>
+          </wp:inline>
+        </w:drawing>
+      </w:r>
+    </w:p>
+    <w:p>
+      <w:r>
+        <w:rPr>
+          <w:noProof/>
+        </w:rPr>
+        <w:lastRenderedPageBreak/>
+        <w:drawing>
+          <wp:inline distT="0" distB="0" distL="0" distR="0" wp14:anchorId="24DAC69D" wp14:editId="04730E59">
+            <wp:extent cx="5943600" cy="6213475"/>
+            <wp:effectExtent l="0" t="0" r="0" b="0"/>
+            <wp:docPr id="21" name="Picture 21"/>
+            <wp:cNvGraphicFramePr>
+              <a:graphicFrameLocks xmlns:a="http://schemas.openxmlformats.org/drawingml/2006/main" noChangeAspect="1"/>
+            </wp:cNvGraphicFramePr>
+            <a:graphic xmlns:a="http://schemas.openxmlformats.org/drawingml/2006/main">
+              <a:graphicData uri="http://schemas.openxmlformats.org/drawingml/2006/picture">
+                <pic:pic xmlns:pic="http://schemas.openxmlformats.org/drawingml/2006/picture">
+                  <pic:nvPicPr>
+                    <pic:cNvPr id="1" name=""/>
+                    <pic:cNvPicPr/>
+                  </pic:nvPicPr>
+                  <pic:blipFill>
+                    <a:blip r:embed="rId23"/>
+                    <a:stretch>
+                      <a:fillRect/>
+                    </a:stretch>
+                  </pic:blipFill>
+                  <pic:spPr>
+                    <a:xfrm>
+                      <a:off x="0" y="0"/>
+                      <a:ext cx="5943600" cy="6213475"/>
+                    </a:xfrm>
+                    <a:prstGeom prst="rect">
+                      <a:avLst/>
+                    </a:prstGeom>
+                  </pic:spPr>
+                </pic:pic>
+              </a:graphicData>
+            </a:graphic>
+          </wp:inline>
+        </w:drawing>
+      </w:r>
+    </w:p>
     <w:sectPr>
       <w:pgSz w:w="12240" w:h="15840"/>
       <w:pgMar w:top="1440" w:right="1440" w:bottom="1440" w:left="1440" w:header="708" w:footer="708" w:gutter="0"/>
@@ -2357,6 +2469,7 @@
   <w:style w:type="character" w:default="1" w:styleId="DefaultParagraphFont">
     <w:name w:val="Default Paragraph Font"/>
     <w:uiPriority w:val="1"/>
+    <w:semiHidden/>
     <w:unhideWhenUsed/>
   </w:style>
   <w:style w:type="table" w:default="1" w:styleId="TableNormal">
@@ -2676,4 +2789,16 @@
     </a:ext>
   </a:extLst>
 </a:theme>
+</file>
+
+<file path=customXml/item1.xml><?xml version="1.0" encoding="utf-8"?>
+<b:Sources xmlns:b="http://schemas.openxmlformats.org/officeDocument/2006/bibliography" xmlns="http://schemas.openxmlformats.org/officeDocument/2006/bibliography" SelectedStyle="\APASixthEditionOfficeOnline.xsl" StyleName="APA" Version="6"/>
+</file>
+
+<file path=customXml/itemProps1.xml><?xml version="1.0" encoding="utf-8"?>
+<ds:datastoreItem xmlns:ds="http://schemas.openxmlformats.org/officeDocument/2006/customXml" ds:itemID="{BC76298B-710B-442F-B193-243EEAC61E36}">
+  <ds:schemaRefs>
+    <ds:schemaRef ds:uri="http://schemas.openxmlformats.org/officeDocument/2006/bibliography"/>
+  </ds:schemaRefs>
+</ds:datastoreItem>
 </file>
</xml_diff>

<commit_message>
Add implementations for corner elements, reverse alternate levels, and right side view of a binary tree
</commit_message>
<xml_diff>
--- a/Day-Wise Docs/DAY18_109940600_VIKASKUMAR.docx
+++ b/Day-Wise Docs/DAY18_109940600_VIKASKUMAR.docx
@@ -250,7 +250,7 @@
                     <pic:cNvPicPr/>
                   </pic:nvPicPr>
                   <pic:blipFill>
-                    <a:blip r:embed="rId5"/>
+                    <a:blip r:embed="rId6"/>
                     <a:stretch>
                       <a:fillRect/>
                     </a:stretch>
@@ -293,7 +293,7 @@
                     <pic:cNvPicPr/>
                   </pic:nvPicPr>
                   <pic:blipFill>
-                    <a:blip r:embed="rId6"/>
+                    <a:blip r:embed="rId7"/>
                     <a:stretch>
                       <a:fillRect/>
                     </a:stretch>
@@ -335,7 +335,7 @@
                     <pic:cNvPicPr/>
                   </pic:nvPicPr>
                   <pic:blipFill>
-                    <a:blip r:embed="rId7"/>
+                    <a:blip r:embed="rId8"/>
                     <a:stretch>
                       <a:fillRect/>
                     </a:stretch>
@@ -449,7 +449,7 @@
                     <pic:cNvPicPr/>
                   </pic:nvPicPr>
                   <pic:blipFill>
-                    <a:blip r:embed="rId8"/>
+                    <a:blip r:embed="rId9"/>
                     <a:stretch>
                       <a:fillRect/>
                     </a:stretch>
@@ -491,7 +491,7 @@
                     <pic:cNvPicPr/>
                   </pic:nvPicPr>
                   <pic:blipFill>
-                    <a:blip r:embed="rId9"/>
+                    <a:blip r:embed="rId10"/>
                     <a:stretch>
                       <a:fillRect/>
                     </a:stretch>
@@ -575,7 +575,7 @@
                     <pic:cNvPicPr/>
                   </pic:nvPicPr>
                   <pic:blipFill>
-                    <a:blip r:embed="rId10"/>
+                    <a:blip r:embed="rId11"/>
                     <a:stretch>
                       <a:fillRect/>
                     </a:stretch>
@@ -617,7 +617,7 @@
                     <pic:cNvPicPr/>
                   </pic:nvPicPr>
                   <pic:blipFill>
-                    <a:blip r:embed="rId11"/>
+                    <a:blip r:embed="rId12"/>
                     <a:stretch>
                       <a:fillRect/>
                     </a:stretch>
@@ -708,7 +708,7 @@
                     <pic:cNvPicPr/>
                   </pic:nvPicPr>
                   <pic:blipFill>
-                    <a:blip r:embed="rId12"/>
+                    <a:blip r:embed="rId13"/>
                     <a:stretch>
                       <a:fillRect/>
                     </a:stretch>
@@ -751,7 +751,7 @@
                     <pic:cNvPicPr/>
                   </pic:nvPicPr>
                   <pic:blipFill>
-                    <a:blip r:embed="rId13"/>
+                    <a:blip r:embed="rId14"/>
                     <a:stretch>
                       <a:fillRect/>
                     </a:stretch>
@@ -925,7 +925,7 @@
                     <pic:cNvPicPr/>
                   </pic:nvPicPr>
                   <pic:blipFill>
-                    <a:blip r:embed="rId14"/>
+                    <a:blip r:embed="rId15"/>
                     <a:stretch>
                       <a:fillRect/>
                     </a:stretch>
@@ -970,7 +970,7 @@
                     <pic:cNvPicPr/>
                   </pic:nvPicPr>
                   <pic:blipFill>
-                    <a:blip r:embed="rId15"/>
+                    <a:blip r:embed="rId16"/>
                     <a:stretch>
                       <a:fillRect/>
                     </a:stretch>
@@ -1321,7 +1321,7 @@
                     <pic:cNvPicPr/>
                   </pic:nvPicPr>
                   <pic:blipFill>
-                    <a:blip r:embed="rId16"/>
+                    <a:blip r:embed="rId17"/>
                     <a:stretch>
                       <a:fillRect/>
                     </a:stretch>
@@ -1364,7 +1364,7 @@
                     <pic:cNvPicPr/>
                   </pic:nvPicPr>
                   <pic:blipFill>
-                    <a:blip r:embed="rId17"/>
+                    <a:blip r:embed="rId18"/>
                     <a:stretch>
                       <a:fillRect/>
                     </a:stretch>
@@ -1779,7 +1779,7 @@
                     </pic:cNvPicPr>
                   </pic:nvPicPr>
                   <pic:blipFill>
-                    <a:blip r:embed="rId18" cstate="print">
+                    <a:blip r:embed="rId19" cstate="print">
                       <a:extLst>
                         <a:ext uri="{28A0092B-C50C-407E-A947-70E740481C1C}">
                           <a14:useLocalDpi xmlns:a14="http://schemas.microsoft.com/office/drawing/2010/main" val="0"/>
@@ -1833,7 +1833,7 @@
                     <pic:cNvPicPr/>
                   </pic:nvPicPr>
                   <pic:blipFill>
-                    <a:blip r:embed="rId19"/>
+                    <a:blip r:embed="rId20"/>
                     <a:stretch>
                       <a:fillRect/>
                     </a:stretch>
@@ -1879,7 +1879,7 @@
                     <pic:cNvPicPr/>
                   </pic:nvPicPr>
                   <pic:blipFill>
-                    <a:blip r:embed="rId20"/>
+                    <a:blip r:embed="rId21"/>
                     <a:stretch>
                       <a:fillRect/>
                     </a:stretch>
@@ -1941,7 +1941,7 @@
                     </pic:cNvPicPr>
                   </pic:nvPicPr>
                   <pic:blipFill>
-                    <a:blip r:embed="rId21" cstate="print">
+                    <a:blip r:embed="rId22" cstate="print">
                       <a:extLst>
                         <a:ext uri="{28A0092B-C50C-407E-A947-70E740481C1C}">
                           <a14:useLocalDpi xmlns:a14="http://schemas.microsoft.com/office/drawing/2010/main" val="0"/>
@@ -1993,7 +1993,7 @@
                     <pic:cNvPicPr/>
                   </pic:nvPicPr>
                   <pic:blipFill>
-                    <a:blip r:embed="rId22"/>
+                    <a:blip r:embed="rId23"/>
                     <a:stretch>
                       <a:fillRect/>
                     </a:stretch>
@@ -2014,6 +2014,7 @@
         </w:drawing>
       </w:r>
     </w:p>
+    <w:p/>
     <w:p>
       <w:r>
         <w:rPr>
@@ -2036,7 +2037,7 @@
                     <pic:cNvPicPr/>
                   </pic:nvPicPr>
                   <pic:blipFill>
-                    <a:blip r:embed="rId23"/>
+                    <a:blip r:embed="rId24"/>
                     <a:stretch>
                       <a:fillRect/>
                     </a:stretch>
@@ -2057,6 +2058,471 @@
         </w:drawing>
       </w:r>
     </w:p>
+    <w:p/>
+    <w:p/>
+    <w:p/>
+    <w:p/>
+    <w:p/>
+    <w:p/>
+    <w:p>
+      <w:pPr>
+        <w:pStyle w:val="Title"/>
+      </w:pPr>
+      <w:r>
+        <w:lastRenderedPageBreak/>
+        <w:t xml:space="preserve">Home Task </w:t>
+      </w:r>
+    </w:p>
+    <w:p>
+      <w:r>
+        <w:t>Task 17: display all corner elements of a tree</w:t>
+      </w:r>
+    </w:p>
+    <w:p>
+      <w:pPr>
+        <w:pStyle w:val="ListParagraph"/>
+        <w:numPr>
+          <w:ilvl w:val="0"/>
+          <w:numId w:val="1"/>
+        </w:numPr>
+      </w:pPr>
+    </w:p>
+    <w:p>
+      <w:pPr>
+        <w:ind w:left="360"/>
+      </w:pPr>
+      <w:r>
+        <w:rPr>
+          <w:noProof/>
+        </w:rPr>
+        <w:drawing>
+          <wp:inline distT="0" distB="0" distL="0" distR="0" wp14:anchorId="79C27F5A" wp14:editId="06F70DBE">
+            <wp:extent cx="5943600" cy="6290945"/>
+            <wp:effectExtent l="0" t="0" r="0" b="0"/>
+            <wp:docPr id="22" name="Picture 22"/>
+            <wp:cNvGraphicFramePr>
+              <a:graphicFrameLocks xmlns:a="http://schemas.openxmlformats.org/drawingml/2006/main" noChangeAspect="1"/>
+            </wp:cNvGraphicFramePr>
+            <a:graphic xmlns:a="http://schemas.openxmlformats.org/drawingml/2006/main">
+              <a:graphicData uri="http://schemas.openxmlformats.org/drawingml/2006/picture">
+                <pic:pic xmlns:pic="http://schemas.openxmlformats.org/drawingml/2006/picture">
+                  <pic:nvPicPr>
+                    <pic:cNvPr id="1" name=""/>
+                    <pic:cNvPicPr/>
+                  </pic:nvPicPr>
+                  <pic:blipFill>
+                    <a:blip r:embed="rId25"/>
+                    <a:stretch>
+                      <a:fillRect/>
+                    </a:stretch>
+                  </pic:blipFill>
+                  <pic:spPr>
+                    <a:xfrm>
+                      <a:off x="0" y="0"/>
+                      <a:ext cx="5943600" cy="6290945"/>
+                    </a:xfrm>
+                    <a:prstGeom prst="rect">
+                      <a:avLst/>
+                    </a:prstGeom>
+                  </pic:spPr>
+                </pic:pic>
+              </a:graphicData>
+            </a:graphic>
+          </wp:inline>
+        </w:drawing>
+      </w:r>
+    </w:p>
+    <w:p>
+      <w:r>
+        <w:rPr>
+          <w:noProof/>
+        </w:rPr>
+        <w:lastRenderedPageBreak/>
+        <w:drawing>
+          <wp:inline distT="0" distB="0" distL="0" distR="0" wp14:anchorId="5875E2D5" wp14:editId="4094450F">
+            <wp:extent cx="5943600" cy="6150610"/>
+            <wp:effectExtent l="0" t="0" r="0" b="2540"/>
+            <wp:docPr id="23" name="Picture 23"/>
+            <wp:cNvGraphicFramePr>
+              <a:graphicFrameLocks xmlns:a="http://schemas.openxmlformats.org/drawingml/2006/main" noChangeAspect="1"/>
+            </wp:cNvGraphicFramePr>
+            <a:graphic xmlns:a="http://schemas.openxmlformats.org/drawingml/2006/main">
+              <a:graphicData uri="http://schemas.openxmlformats.org/drawingml/2006/picture">
+                <pic:pic xmlns:pic="http://schemas.openxmlformats.org/drawingml/2006/picture">
+                  <pic:nvPicPr>
+                    <pic:cNvPr id="1" name=""/>
+                    <pic:cNvPicPr/>
+                  </pic:nvPicPr>
+                  <pic:blipFill>
+                    <a:blip r:embed="rId26"/>
+                    <a:stretch>
+                      <a:fillRect/>
+                    </a:stretch>
+                  </pic:blipFill>
+                  <pic:spPr>
+                    <a:xfrm>
+                      <a:off x="0" y="0"/>
+                      <a:ext cx="5943600" cy="6150610"/>
+                    </a:xfrm>
+                    <a:prstGeom prst="rect">
+                      <a:avLst/>
+                    </a:prstGeom>
+                  </pic:spPr>
+                </pic:pic>
+              </a:graphicData>
+            </a:graphic>
+          </wp:inline>
+        </w:drawing>
+      </w:r>
+    </w:p>
+    <w:p/>
+    <w:p/>
+    <w:p>
+      <w:r>
+        <w:drawing>
+          <wp:inline distT="0" distB="0" distL="0" distR="0" wp14:anchorId="0D7D25DF" wp14:editId="773C1B1F">
+            <wp:extent cx="5943600" cy="638175"/>
+            <wp:effectExtent l="0" t="0" r="0" b="9525"/>
+            <wp:docPr id="24" name="Picture 24"/>
+            <wp:cNvGraphicFramePr>
+              <a:graphicFrameLocks xmlns:a="http://schemas.openxmlformats.org/drawingml/2006/main" noChangeAspect="1"/>
+            </wp:cNvGraphicFramePr>
+            <a:graphic xmlns:a="http://schemas.openxmlformats.org/drawingml/2006/main">
+              <a:graphicData uri="http://schemas.openxmlformats.org/drawingml/2006/picture">
+                <pic:pic xmlns:pic="http://schemas.openxmlformats.org/drawingml/2006/picture">
+                  <pic:nvPicPr>
+                    <pic:cNvPr id="1" name=""/>
+                    <pic:cNvPicPr/>
+                  </pic:nvPicPr>
+                  <pic:blipFill>
+                    <a:blip r:embed="rId27"/>
+                    <a:stretch>
+                      <a:fillRect/>
+                    </a:stretch>
+                  </pic:blipFill>
+                  <pic:spPr>
+                    <a:xfrm>
+                      <a:off x="0" y="0"/>
+                      <a:ext cx="5943600" cy="638175"/>
+                    </a:xfrm>
+                    <a:prstGeom prst="rect">
+                      <a:avLst/>
+                    </a:prstGeom>
+                  </pic:spPr>
+                </pic:pic>
+              </a:graphicData>
+            </a:graphic>
+          </wp:inline>
+        </w:drawing>
+      </w:r>
+    </w:p>
+    <w:p/>
+    <w:p/>
+    <w:p>
+      <w:r>
+        <w:lastRenderedPageBreak/>
+        <w:t>Task 18</w:t>
+      </w:r>
+      <w:r>
+        <w:t>:</w:t>
+      </w:r>
+      <w:r>
+        <w:t xml:space="preserve"> Reverse Alternate levels</w:t>
+      </w:r>
+    </w:p>
+    <w:p>
+      <w:r>
+        <w:t>A)</w:t>
+      </w:r>
+      <w:r>
+        <w:rPr>
+          <w:noProof/>
+        </w:rPr>
+        <w:t xml:space="preserve"> </w:t>
+      </w:r>
+      <w:r>
+        <w:rPr>
+          <w:noProof/>
+        </w:rPr>
+        <w:drawing>
+          <wp:inline distT="0" distB="0" distL="0" distR="0" wp14:anchorId="7D88D56A" wp14:editId="691006C6">
+            <wp:extent cx="5943600" cy="7446010"/>
+            <wp:effectExtent l="0" t="0" r="0" b="2540"/>
+            <wp:docPr id="25" name="Picture 25"/>
+            <wp:cNvGraphicFramePr>
+              <a:graphicFrameLocks xmlns:a="http://schemas.openxmlformats.org/drawingml/2006/main" noChangeAspect="1"/>
+            </wp:cNvGraphicFramePr>
+            <a:graphic xmlns:a="http://schemas.openxmlformats.org/drawingml/2006/main">
+              <a:graphicData uri="http://schemas.openxmlformats.org/drawingml/2006/picture">
+                <pic:pic xmlns:pic="http://schemas.openxmlformats.org/drawingml/2006/picture">
+                  <pic:nvPicPr>
+                    <pic:cNvPr id="1" name=""/>
+                    <pic:cNvPicPr/>
+                  </pic:nvPicPr>
+                  <pic:blipFill>
+                    <a:blip r:embed="rId28"/>
+                    <a:stretch>
+                      <a:fillRect/>
+                    </a:stretch>
+                  </pic:blipFill>
+                  <pic:spPr>
+                    <a:xfrm>
+                      <a:off x="0" y="0"/>
+                      <a:ext cx="5943600" cy="7446010"/>
+                    </a:xfrm>
+                    <a:prstGeom prst="rect">
+                      <a:avLst/>
+                    </a:prstGeom>
+                  </pic:spPr>
+                </pic:pic>
+              </a:graphicData>
+            </a:graphic>
+          </wp:inline>
+        </w:drawing>
+      </w:r>
+    </w:p>
+    <w:p>
+      <w:r>
+        <w:rPr>
+          <w:noProof/>
+        </w:rPr>
+        <w:lastRenderedPageBreak/>
+        <w:drawing>
+          <wp:inline distT="0" distB="0" distL="0" distR="0" wp14:anchorId="033C7AF0" wp14:editId="431BAB33">
+            <wp:extent cx="5943600" cy="5417820"/>
+            <wp:effectExtent l="0" t="0" r="0" b="0"/>
+            <wp:docPr id="26" name="Picture 26"/>
+            <wp:cNvGraphicFramePr>
+              <a:graphicFrameLocks xmlns:a="http://schemas.openxmlformats.org/drawingml/2006/main" noChangeAspect="1"/>
+            </wp:cNvGraphicFramePr>
+            <a:graphic xmlns:a="http://schemas.openxmlformats.org/drawingml/2006/main">
+              <a:graphicData uri="http://schemas.openxmlformats.org/drawingml/2006/picture">
+                <pic:pic xmlns:pic="http://schemas.openxmlformats.org/drawingml/2006/picture">
+                  <pic:nvPicPr>
+                    <pic:cNvPr id="1" name=""/>
+                    <pic:cNvPicPr/>
+                  </pic:nvPicPr>
+                  <pic:blipFill>
+                    <a:blip r:embed="rId29"/>
+                    <a:stretch>
+                      <a:fillRect/>
+                    </a:stretch>
+                  </pic:blipFill>
+                  <pic:spPr>
+                    <a:xfrm>
+                      <a:off x="0" y="0"/>
+                      <a:ext cx="5943600" cy="5417820"/>
+                    </a:xfrm>
+                    <a:prstGeom prst="rect">
+                      <a:avLst/>
+                    </a:prstGeom>
+                  </pic:spPr>
+                </pic:pic>
+              </a:graphicData>
+            </a:graphic>
+          </wp:inline>
+        </w:drawing>
+      </w:r>
+    </w:p>
+    <w:p/>
+    <w:p>
+      <w:r>
+        <w:drawing>
+          <wp:inline distT="0" distB="0" distL="0" distR="0" wp14:anchorId="2EC49B05" wp14:editId="596031D0">
+            <wp:extent cx="5943600" cy="408305"/>
+            <wp:effectExtent l="0" t="0" r="0" b="0"/>
+            <wp:docPr id="30" name="Picture 30"/>
+            <wp:cNvGraphicFramePr>
+              <a:graphicFrameLocks xmlns:a="http://schemas.openxmlformats.org/drawingml/2006/main" noChangeAspect="1"/>
+            </wp:cNvGraphicFramePr>
+            <a:graphic xmlns:a="http://schemas.openxmlformats.org/drawingml/2006/main">
+              <a:graphicData uri="http://schemas.openxmlformats.org/drawingml/2006/picture">
+                <pic:pic xmlns:pic="http://schemas.openxmlformats.org/drawingml/2006/picture">
+                  <pic:nvPicPr>
+                    <pic:cNvPr id="1" name=""/>
+                    <pic:cNvPicPr/>
+                  </pic:nvPicPr>
+                  <pic:blipFill>
+                    <a:blip r:embed="rId30"/>
+                    <a:stretch>
+                      <a:fillRect/>
+                    </a:stretch>
+                  </pic:blipFill>
+                  <pic:spPr>
+                    <a:xfrm>
+                      <a:off x="0" y="0"/>
+                      <a:ext cx="5943600" cy="408305"/>
+                    </a:xfrm>
+                    <a:prstGeom prst="rect">
+                      <a:avLst/>
+                    </a:prstGeom>
+                  </pic:spPr>
+                </pic:pic>
+              </a:graphicData>
+            </a:graphic>
+          </wp:inline>
+        </w:drawing>
+      </w:r>
+    </w:p>
+    <w:p/>
+    <w:p/>
+    <w:p/>
+    <w:p/>
+    <w:p/>
+    <w:p/>
+    <w:p/>
+    <w:p>
+      <w:r>
+        <w:lastRenderedPageBreak/>
+        <w:t>Task 19</w:t>
+      </w:r>
+      <w:r>
+        <w:t>:</w:t>
+      </w:r>
+      <w:r>
+        <w:t xml:space="preserve"> (leetcode problem statement) right side view</w:t>
+      </w:r>
+    </w:p>
+    <w:p>
+      <w:r>
+        <w:t>A)</w:t>
+      </w:r>
+    </w:p>
+    <w:p>
+      <w:pPr>
+        <w:rPr>
+          <w:noProof/>
+        </w:rPr>
+      </w:pPr>
+      <w:r>
+        <w:rPr>
+          <w:noProof/>
+        </w:rPr>
+        <w:t xml:space="preserve"> </w:t>
+      </w:r>
+      <w:r>
+        <w:rPr>
+          <w:noProof/>
+        </w:rPr>
+        <w:drawing>
+          <wp:inline distT="0" distB="0" distL="0" distR="0" wp14:anchorId="6A8C3E8D" wp14:editId="70D9190D">
+            <wp:extent cx="5575300" cy="6731000"/>
+            <wp:effectExtent l="0" t="0" r="6350" b="0"/>
+            <wp:docPr id="27" name="Picture 27"/>
+            <wp:cNvGraphicFramePr>
+              <a:graphicFrameLocks xmlns:a="http://schemas.openxmlformats.org/drawingml/2006/main" noChangeAspect="1"/>
+            </wp:cNvGraphicFramePr>
+            <a:graphic xmlns:a="http://schemas.openxmlformats.org/drawingml/2006/main">
+              <a:graphicData uri="http://schemas.openxmlformats.org/drawingml/2006/picture">
+                <pic:pic xmlns:pic="http://schemas.openxmlformats.org/drawingml/2006/picture">
+                  <pic:nvPicPr>
+                    <pic:cNvPr id="1" name=""/>
+                    <pic:cNvPicPr/>
+                  </pic:nvPicPr>
+                  <pic:blipFill>
+                    <a:blip r:embed="rId31"/>
+                    <a:stretch>
+                      <a:fillRect/>
+                    </a:stretch>
+                  </pic:blipFill>
+                  <pic:spPr>
+                    <a:xfrm>
+                      <a:off x="0" y="0"/>
+                      <a:ext cx="5575300" cy="6731000"/>
+                    </a:xfrm>
+                    <a:prstGeom prst="rect">
+                      <a:avLst/>
+                    </a:prstGeom>
+                  </pic:spPr>
+                </pic:pic>
+              </a:graphicData>
+            </a:graphic>
+          </wp:inline>
+        </w:drawing>
+      </w:r>
+    </w:p>
+    <w:p>
+      <w:r>
+        <w:rPr>
+          <w:noProof/>
+        </w:rPr>
+        <w:lastRenderedPageBreak/>
+        <w:drawing>
+          <wp:inline distT="0" distB="0" distL="0" distR="0" wp14:anchorId="2C20741D" wp14:editId="30862061">
+            <wp:extent cx="5943600" cy="5823585"/>
+            <wp:effectExtent l="0" t="0" r="0" b="5715"/>
+            <wp:docPr id="28" name="Picture 28"/>
+            <wp:cNvGraphicFramePr>
+              <a:graphicFrameLocks xmlns:a="http://schemas.openxmlformats.org/drawingml/2006/main" noChangeAspect="1"/>
+            </wp:cNvGraphicFramePr>
+            <a:graphic xmlns:a="http://schemas.openxmlformats.org/drawingml/2006/main">
+              <a:graphicData uri="http://schemas.openxmlformats.org/drawingml/2006/picture">
+                <pic:pic xmlns:pic="http://schemas.openxmlformats.org/drawingml/2006/picture">
+                  <pic:nvPicPr>
+                    <pic:cNvPr id="1" name=""/>
+                    <pic:cNvPicPr/>
+                  </pic:nvPicPr>
+                  <pic:blipFill>
+                    <a:blip r:embed="rId32"/>
+                    <a:stretch>
+                      <a:fillRect/>
+                    </a:stretch>
+                  </pic:blipFill>
+                  <pic:spPr>
+                    <a:xfrm>
+                      <a:off x="0" y="0"/>
+                      <a:ext cx="5943600" cy="5823585"/>
+                    </a:xfrm>
+                    <a:prstGeom prst="rect">
+                      <a:avLst/>
+                    </a:prstGeom>
+                  </pic:spPr>
+                </pic:pic>
+              </a:graphicData>
+            </a:graphic>
+          </wp:inline>
+        </w:drawing>
+      </w:r>
+    </w:p>
+    <w:p>
+      <w:r>
+        <w:drawing>
+          <wp:inline distT="0" distB="0" distL="0" distR="0" wp14:anchorId="24AD0A99" wp14:editId="1996D4BD">
+            <wp:extent cx="5943600" cy="429260"/>
+            <wp:effectExtent l="0" t="0" r="0" b="8890"/>
+            <wp:docPr id="29" name="Picture 29"/>
+            <wp:cNvGraphicFramePr>
+              <a:graphicFrameLocks xmlns:a="http://schemas.openxmlformats.org/drawingml/2006/main" noChangeAspect="1"/>
+            </wp:cNvGraphicFramePr>
+            <a:graphic xmlns:a="http://schemas.openxmlformats.org/drawingml/2006/main">
+              <a:graphicData uri="http://schemas.openxmlformats.org/drawingml/2006/picture">
+                <pic:pic xmlns:pic="http://schemas.openxmlformats.org/drawingml/2006/picture">
+                  <pic:nvPicPr>
+                    <pic:cNvPr id="1" name=""/>
+                    <pic:cNvPicPr/>
+                  </pic:nvPicPr>
+                  <pic:blipFill>
+                    <a:blip r:embed="rId33"/>
+                    <a:stretch>
+                      <a:fillRect/>
+                    </a:stretch>
+                  </pic:blipFill>
+                  <pic:spPr>
+                    <a:xfrm>
+                      <a:off x="0" y="0"/>
+                      <a:ext cx="5943600" cy="429260"/>
+                    </a:xfrm>
+                    <a:prstGeom prst="rect">
+                      <a:avLst/>
+                    </a:prstGeom>
+                  </pic:spPr>
+                </pic:pic>
+              </a:graphicData>
+            </a:graphic>
+          </wp:inline>
+        </w:drawing>
+      </w:r>
+    </w:p>
     <w:sectPr>
       <w:pgSz w:w="12240" w:h="15840"/>
       <w:pgMar w:top="1440" w:right="1440" w:bottom="1440" w:left="1440" w:header="708" w:footer="708" w:gutter="0"/>
@@ -2065,6 +2531,103 @@
     </w:sectPr>
   </w:body>
 </w:document>
+</file>
+
+<file path=word/numbering.xml><?xml version="1.0" encoding="utf-8"?>
+<w:numbering xmlns:wpc="http://schemas.microsoft.com/office/word/2010/wordprocessingCanvas" xmlns:cx="http://schemas.microsoft.com/office/drawing/2014/chartex" xmlns:cx1="http://schemas.microsoft.com/office/drawing/2015/9/8/chartex" xmlns:cx2="http://schemas.microsoft.com/office/drawing/2015/10/21/chartex" xmlns:cx3="http://schemas.microsoft.com/office/drawing/2016/5/9/chartex" xmlns:cx4="http://schemas.microsoft.com/office/drawing/2016/5/10/chartex" xmlns:cx5="http://schemas.microsoft.com/office/drawing/2016/5/11/chartex" xmlns:cx6="http://schemas.microsoft.com/office/drawing/2016/5/12/chartex" xmlns:cx7="http://schemas.microsoft.com/office/drawing/2016/5/13/chartex" xmlns:cx8="http://schemas.microsoft.com/office/drawing/2016/5/14/chartex" xmlns:mc="http://schemas.openxmlformats.org/markup-compatibility/2006" xmlns:aink="http://schemas.microsoft.com/office/drawing/2016/ink" xmlns:am3d="http://schemas.microsoft.com/office/drawing/2017/model3d" xmlns:o="urn:schemas-microsoft-com:office:office" xmlns:r="http://schemas.openxmlformats.org/officeDocument/2006/relationships" xmlns:m="http://schemas.openxmlformats.org/officeDocument/2006/math" xmlns:v="urn:schemas-microsoft-com:vml" xmlns:wp14="http://schemas.microsoft.com/office/word/2010/wordprocessingDrawing" xmlns:wp="http://schemas.openxmlformats.org/drawingml/2006/wordprocessingDrawing" xmlns:w10="urn:schemas-microsoft-com:office:word" xmlns:w="http://schemas.openxmlformats.org/wordprocessingml/2006/main" xmlns:w14="http://schemas.microsoft.com/office/word/2010/wordml" xmlns:w15="http://schemas.microsoft.com/office/word/2012/wordml" xmlns:w16cex="http://schemas.microsoft.com/office/word/2018/wordml/cex" xmlns:w16cid="http://schemas.microsoft.com/office/word/2016/wordml/cid" xmlns:w16="http://schemas.microsoft.com/office/word/2018/wordml" xmlns:w16sdtdh="http://schemas.microsoft.com/office/word/2020/wordml/sdtdatahash" xmlns:w16se="http://schemas.microsoft.com/office/word/2015/wordml/symex" xmlns:wpg="http://schemas.microsoft.com/office/word/2010/wordprocessingGroup" xmlns:wpi="http://schemas.microsoft.com/office/word/2010/wordprocessingInk" xmlns:wne="http://schemas.microsoft.com/office/word/2006/wordml" xmlns:wps="http://schemas.microsoft.com/office/word/2010/wordprocessingShape" mc:Ignorable="w14 w15 w16se w16cid w16 w16cex w16sdtdh wp14">
+  <w:abstractNum w:abstractNumId="0" w15:restartNumberingAfterBreak="0">
+    <w:nsid w:val="6BD346D0"/>
+    <w:multiLevelType w:val="hybridMultilevel"/>
+    <w:tmpl w:val="7CCE85C8"/>
+    <w:lvl w:ilvl="0" w:tplc="FA60D39A">
+      <w:start w:val="1"/>
+      <w:numFmt w:val="upperLetter"/>
+      <w:lvlText w:val="%1)"/>
+      <w:lvlJc w:val="left"/>
+      <w:pPr>
+        <w:ind w:left="720" w:hanging="360"/>
+      </w:pPr>
+      <w:rPr>
+        <w:rFonts w:hint="default"/>
+      </w:rPr>
+    </w:lvl>
+    <w:lvl w:ilvl="1" w:tplc="04090019" w:tentative="1">
+      <w:start w:val="1"/>
+      <w:numFmt w:val="lowerLetter"/>
+      <w:lvlText w:val="%2."/>
+      <w:lvlJc w:val="left"/>
+      <w:pPr>
+        <w:ind w:left="1440" w:hanging="360"/>
+      </w:pPr>
+    </w:lvl>
+    <w:lvl w:ilvl="2" w:tplc="0409001B" w:tentative="1">
+      <w:start w:val="1"/>
+      <w:numFmt w:val="lowerRoman"/>
+      <w:lvlText w:val="%3."/>
+      <w:lvlJc w:val="right"/>
+      <w:pPr>
+        <w:ind w:left="2160" w:hanging="180"/>
+      </w:pPr>
+    </w:lvl>
+    <w:lvl w:ilvl="3" w:tplc="0409000F" w:tentative="1">
+      <w:start w:val="1"/>
+      <w:numFmt w:val="decimal"/>
+      <w:lvlText w:val="%4."/>
+      <w:lvlJc w:val="left"/>
+      <w:pPr>
+        <w:ind w:left="2880" w:hanging="360"/>
+      </w:pPr>
+    </w:lvl>
+    <w:lvl w:ilvl="4" w:tplc="04090019" w:tentative="1">
+      <w:start w:val="1"/>
+      <w:numFmt w:val="lowerLetter"/>
+      <w:lvlText w:val="%5."/>
+      <w:lvlJc w:val="left"/>
+      <w:pPr>
+        <w:ind w:left="3600" w:hanging="360"/>
+      </w:pPr>
+    </w:lvl>
+    <w:lvl w:ilvl="5" w:tplc="0409001B" w:tentative="1">
+      <w:start w:val="1"/>
+      <w:numFmt w:val="lowerRoman"/>
+      <w:lvlText w:val="%6."/>
+      <w:lvlJc w:val="right"/>
+      <w:pPr>
+        <w:ind w:left="4320" w:hanging="180"/>
+      </w:pPr>
+    </w:lvl>
+    <w:lvl w:ilvl="6" w:tplc="0409000F" w:tentative="1">
+      <w:start w:val="1"/>
+      <w:numFmt w:val="decimal"/>
+      <w:lvlText w:val="%7."/>
+      <w:lvlJc w:val="left"/>
+      <w:pPr>
+        <w:ind w:left="5040" w:hanging="360"/>
+      </w:pPr>
+    </w:lvl>
+    <w:lvl w:ilvl="7" w:tplc="04090019" w:tentative="1">
+      <w:start w:val="1"/>
+      <w:numFmt w:val="lowerLetter"/>
+      <w:lvlText w:val="%8."/>
+      <w:lvlJc w:val="left"/>
+      <w:pPr>
+        <w:ind w:left="5760" w:hanging="360"/>
+      </w:pPr>
+    </w:lvl>
+    <w:lvl w:ilvl="8" w:tplc="0409001B" w:tentative="1">
+      <w:start w:val="1"/>
+      <w:numFmt w:val="lowerRoman"/>
+      <w:lvlText w:val="%9."/>
+      <w:lvlJc w:val="right"/>
+      <w:pPr>
+        <w:ind w:left="6480" w:hanging="180"/>
+      </w:pPr>
+    </w:lvl>
+  </w:abstractNum>
+  <w:num w:numId="1">
+    <w:abstractNumId w:val="0"/>
+  </w:num>
+</w:numbering>
 </file>
 
 <file path=word/styles.xml><?xml version="1.0" encoding="utf-8"?>
@@ -2493,6 +3056,51 @@
     <w:semiHidden/>
     <w:unhideWhenUsed/>
   </w:style>
+  <w:style w:type="paragraph" w:styleId="ListParagraph">
+    <w:name w:val="List Paragraph"/>
+    <w:basedOn w:val="Normal"/>
+    <w:uiPriority w:val="34"/>
+    <w:qFormat/>
+    <w:rsid w:val="00752110"/>
+    <w:pPr>
+      <w:ind w:left="720"/>
+      <w:contextualSpacing/>
+    </w:pPr>
+  </w:style>
+  <w:style w:type="paragraph" w:styleId="Title">
+    <w:name w:val="Title"/>
+    <w:basedOn w:val="Normal"/>
+    <w:next w:val="Normal"/>
+    <w:link w:val="TitleChar"/>
+    <w:uiPriority w:val="10"/>
+    <w:qFormat/>
+    <w:rsid w:val="00752110"/>
+    <w:pPr>
+      <w:spacing w:after="0" w:line="240" w:lineRule="auto"/>
+      <w:contextualSpacing/>
+    </w:pPr>
+    <w:rPr>
+      <w:rFonts w:asciiTheme="majorHAnsi" w:eastAsiaTheme="majorEastAsia" w:hAnsiTheme="majorHAnsi" w:cstheme="majorBidi"/>
+      <w:spacing w:val="-10"/>
+      <w:kern w:val="28"/>
+      <w:sz w:val="56"/>
+      <w:szCs w:val="56"/>
+    </w:rPr>
+  </w:style>
+  <w:style w:type="character" w:customStyle="1" w:styleId="TitleChar">
+    <w:name w:val="Title Char"/>
+    <w:basedOn w:val="DefaultParagraphFont"/>
+    <w:link w:val="Title"/>
+    <w:uiPriority w:val="10"/>
+    <w:rsid w:val="00752110"/>
+    <w:rPr>
+      <w:rFonts w:asciiTheme="majorHAnsi" w:eastAsiaTheme="majorEastAsia" w:hAnsiTheme="majorHAnsi" w:cstheme="majorBidi"/>
+      <w:spacing w:val="-10"/>
+      <w:kern w:val="28"/>
+      <w:sz w:val="56"/>
+      <w:szCs w:val="56"/>
+    </w:rPr>
+  </w:style>
 </w:styles>
 </file>
 

</xml_diff>